<commit_message>
fixed 6 but need activity
</commit_message>
<xml_diff>
--- a/docs/ecostats_lectures/lecture_06/06_01_lecture_powerpoint.docx
+++ b/docs/ecostats_lectures/lecture_06/06_01_lecture_powerpoint.docx
@@ -380,7 +380,13 @@
         </w:numPr>
       </w:pPr>
       <w:r>
-        <w:t xml:space="preserve">Hypotheses ask whether samples come from populations with certain properties</w:t>
+        <w:t xml:space="preserve">Hypotheses ask whether samples come from populations with</w:t>
+      </w:r>
+      <w:r>
+        <w:t xml:space="preserve"> </w:t>
+      </w:r>
+      <w:r>
+        <w:t xml:space="preserve">certain properties</w:t>
       </w:r>
     </w:p>
     <w:p>
@@ -484,6 +490,7 @@
     </w:p>
     <w:p>
       <w:pPr>
+        <w:pStyle w:val="Compact"/>
         <w:numPr>
           <w:ilvl w:val="0"/>
           <w:numId w:val="1008"/>
@@ -495,6 +502,7 @@
     </w:p>
     <w:p>
       <w:pPr>
+        <w:pStyle w:val="Compact"/>
         <w:numPr>
           <w:ilvl w:val="1"/>
           <w:numId w:val="1009"/>
@@ -512,7 +520,6 @@
     </w:p>
     <w:p>
       <w:pPr>
-        <w:pStyle w:val="Compact"/>
         <w:numPr>
           <w:ilvl w:val="2"/>
           <w:numId w:val="1010"/>
@@ -524,7 +531,6 @@
     </w:p>
     <w:p>
       <w:pPr>
-        <w:pStyle w:val="Compact"/>
         <w:numPr>
           <w:ilvl w:val="2"/>
           <w:numId w:val="1010"/>
@@ -536,6 +542,7 @@
     </w:p>
     <w:p>
       <w:pPr>
+        <w:pStyle w:val="Compact"/>
         <w:numPr>
           <w:ilvl w:val="1"/>
           <w:numId w:val="1009"/>
@@ -662,6 +669,7 @@
     </w:p>
     <w:p>
       <w:pPr>
+        <w:pStyle w:val="Compact"/>
         <w:numPr>
           <w:ilvl w:val="0"/>
           <w:numId w:val="1012"/>
@@ -685,6 +693,7 @@
     </w:p>
     <w:p>
       <w:pPr>
+        <w:pStyle w:val="Compact"/>
         <w:numPr>
           <w:ilvl w:val="0"/>
           <w:numId w:val="1012"/>
@@ -708,6 +717,7 @@
     </w:p>
     <w:p>
       <w:pPr>
+        <w:pStyle w:val="Compact"/>
         <w:numPr>
           <w:ilvl w:val="0"/>
           <w:numId w:val="1012"/>
@@ -731,6 +741,7 @@
     </w:p>
     <w:p>
       <w:pPr>
+        <w:pStyle w:val="Compact"/>
         <w:numPr>
           <w:ilvl w:val="0"/>
           <w:numId w:val="1012"/>
@@ -748,7 +759,13 @@
         </w:numPr>
       </w:pPr>
       <w:r>
-        <w:t xml:space="preserve">can be directional mean is greater than 0 or mean is not equal or less than 0</w:t>
+        <w:t xml:space="preserve">can be directional mean is greater than 0 or mean is not equal</w:t>
+      </w:r>
+      <w:r>
+        <w:t xml:space="preserve"> </w:t>
+      </w:r>
+      <w:r>
+        <w:t xml:space="preserve">or less than 0</w:t>
       </w:r>
     </w:p>
     <w:p>
@@ -870,7 +887,13 @@
         </w:numPr>
       </w:pPr>
       <w:r>
-        <w:t xml:space="preserve">the long run probability of obtaining sample value (or more extreme one) if the null hypothesis is true</w:t>
+        <w:t xml:space="preserve">the long run probability of obtaining sample value (or more</w:t>
+      </w:r>
+      <w:r>
+        <w:t xml:space="preserve"> </w:t>
+      </w:r>
+      <w:r>
+        <w:t xml:space="preserve">extreme one) if the null hypothesis is true</w:t>
       </w:r>
     </w:p>
     <w:p>
@@ -882,7 +905,13 @@
         </w:numPr>
       </w:pPr>
       <w:r>
-        <w:t xml:space="preserve">p(data|Ho) - the probability of observing the data given that the null hypothesis Ho is true</w:t>
+        <w:t xml:space="preserve">p(data|Ho) - the probability of observing the data given</w:t>
+      </w:r>
+      <w:r>
+        <w:t xml:space="preserve"> </w:t>
+      </w:r>
+      <w:r>
+        <w:t xml:space="preserve">that the null hypothesis Ho is true</w:t>
       </w:r>
     </w:p>
     <w:p>
@@ -993,7 +1022,13 @@
         </w:numPr>
       </w:pPr>
       <w:r>
-        <w:t xml:space="preserve">probability of obtaining sample value of statistic (or more extreme one) if Ho is true</w:t>
+        <w:t xml:space="preserve">probability of obtaining sample value of statistic (or more</w:t>
+      </w:r>
+      <w:r>
+        <w:t xml:space="preserve"> </w:t>
+      </w:r>
+      <w:r>
+        <w:t xml:space="preserve">extreme one) if Ho is true</w:t>
       </w:r>
     </w:p>
     <w:p>
@@ -1029,7 +1064,13 @@
         </w:numPr>
       </w:pPr>
       <w:r>
-        <w:t xml:space="preserve">if the null hypothesis (Ho) were true, you would frequently observe data similar to your sample statistic</w:t>
+        <w:t xml:space="preserve">if the null hypothesis (Ho) were true, you would frequently</w:t>
+      </w:r>
+      <w:r>
+        <w:t xml:space="preserve"> </w:t>
+      </w:r>
+      <w:r>
+        <w:t xml:space="preserve">observe data similar to your sample statistic</w:t>
       </w:r>
     </w:p>
     <w:p>
@@ -1041,7 +1082,13 @@
         </w:numPr>
       </w:pPr>
       <w:r>
-        <w:t xml:space="preserve">your observed results are quite compatible with what the null hypothesis predicts</w:t>
+        <w:t xml:space="preserve">your observed results are quite compatible with what the</w:t>
+      </w:r>
+      <w:r>
+        <w:t xml:space="preserve"> </w:t>
+      </w:r>
+      <w:r>
+        <w:t xml:space="preserve">null hypothesis predicts</w:t>
       </w:r>
     </w:p>
     <w:p>
@@ -1065,7 +1112,13 @@
         </w:numPr>
       </w:pPr>
       <w:r>
-        <w:t xml:space="preserve">if the null hypothesis (Ho) were true, you would rarely observe data similar to or more extreme than your sample statistic</w:t>
+        <w:t xml:space="preserve">if the null hypothesis (Ho) were true, you would rarely observe</w:t>
+      </w:r>
+      <w:r>
+        <w:t xml:space="preserve"> </w:t>
+      </w:r>
+      <w:r>
+        <w:t xml:space="preserve">data similar to or more extreme than your sample statistic</w:t>
       </w:r>
     </w:p>
     <w:p>
@@ -1077,7 +1130,19 @@
         </w:numPr>
       </w:pPr>
       <w:r>
-        <w:t xml:space="preserve">Your results are unusual under the null hypothesis, suggesting that either you’ve witnessed a rare event or the null hypothesis may be incorrect</w:t>
+        <w:t xml:space="preserve">Your results are unusual under the null hypothesis, suggesting</w:t>
+      </w:r>
+      <w:r>
+        <w:t xml:space="preserve"> </w:t>
+      </w:r>
+      <w:r>
+        <w:t xml:space="preserve">that either you’ve witnessed a rare event or the null hypothesis</w:t>
+      </w:r>
+      <w:r>
+        <w:t xml:space="preserve"> </w:t>
+      </w:r>
+      <w:r>
+        <w:t xml:space="preserve">may be incorrect</w:t>
       </w:r>
     </w:p>
     <w:p>
@@ -1163,7 +1228,23 @@
         </w:numPr>
       </w:pPr>
       <w:r>
-        <w:t xml:space="preserve">p = 0.3 means that if I repeated the study 100 times, I would get this (or more extreme) result due to chance 30 times</w:t>
+        <w:t xml:space="preserve">p = 0.3 means that if I repeated the study 100 times, I would get</w:t>
+      </w:r>
+      <w:r>
+        <w:t xml:space="preserve"> </w:t>
+      </w:r>
+      <w:r>
+        <w:t xml:space="preserve">this (or more extreme) result due to chance</w:t>
+      </w:r>
+      <w:r>
+        <w:t xml:space="preserve"> </w:t>
+      </w:r>
+      <w:r>
+        <w:rPr>
+          <w:b/>
+          <w:bCs/>
+        </w:rPr>
+        <w:t xml:space="preserve">30 times</w:t>
       </w:r>
     </w:p>
     <w:p>
@@ -1174,7 +1255,23 @@
         </w:numPr>
       </w:pPr>
       <w:r>
-        <w:t xml:space="preserve">p = 0.03 means that if I repeated the study 100 times, I would get this (or more extreme) result due to chance 3 times</w:t>
+        <w:t xml:space="preserve">p = 0.03 means that if I repeated the study 100 times, I would get</w:t>
+      </w:r>
+      <w:r>
+        <w:t xml:space="preserve"> </w:t>
+      </w:r>
+      <w:r>
+        <w:t xml:space="preserve">this (or more extreme) result due to chance</w:t>
+      </w:r>
+      <w:r>
+        <w:t xml:space="preserve"> </w:t>
+      </w:r>
+      <w:r>
+        <w:rPr>
+          <w:b/>
+          <w:bCs/>
+        </w:rPr>
+        <w:t xml:space="preserve">3 times</w:t>
       </w:r>
     </w:p>
     <w:p>
@@ -1234,7 +1331,13 @@
         </w:numPr>
       </w:pPr>
       <w:r>
-        <w:t xml:space="preserve">we would get this (or more extreme) result less than 5 times due to chance</w:t>
+        <w:t xml:space="preserve">we would get this (or more extreme) result less than 5 times due to</w:t>
+      </w:r>
+      <w:r>
+        <w:t xml:space="preserve"> </w:t>
+      </w:r>
+      <w:r>
+        <w:t xml:space="preserve">chance</w:t>
       </w:r>
     </w:p>
     <w:bookmarkEnd w:id="46"/>
@@ -1274,7 +1377,25 @@
         </w:numPr>
       </w:pPr>
       <w:r>
-        <w:t xml:space="preserve">α is the rate at which we will reject a true null hypothesis (Type I error rate)</w:t>
+        <w:rPr>
+          <w:b/>
+          <w:bCs/>
+        </w:rPr>
+        <w:t xml:space="preserve">α is the rate at which we will reject a true null hypothesis (Type</w:t>
+      </w:r>
+      <w:r>
+        <w:rPr>
+          <w:b/>
+          <w:bCs/>
+        </w:rPr>
+        <w:t xml:space="preserve"> </w:t>
+      </w:r>
+      <w:r>
+        <w:rPr>
+          <w:b/>
+          <w:bCs/>
+        </w:rPr>
+        <w:t xml:space="preserve">I error rate)</w:t>
       </w:r>
     </w:p>
     <w:p>
@@ -1286,7 +1407,13 @@
         </w:numPr>
       </w:pPr>
       <w:r>
-        <w:t xml:space="preserve">Lowering α will lower likelihood of incorrectly rejecting a true null hypothesis (e.g., 0.01, 0.001)</w:t>
+        <w:t xml:space="preserve">Lowering α will lower likelihood of incorrectly rejecting a true</w:t>
+      </w:r>
+      <w:r>
+        <w:t xml:space="preserve"> </w:t>
+      </w:r>
+      <w:r>
+        <w:t xml:space="preserve">null hypothesis (e.g., 0.01, 0.001)</w:t>
       </w:r>
     </w:p>
     <w:p>
@@ -1312,7 +1439,21 @@
           <w:i/>
           <w:iCs/>
         </w:rPr>
-        <w:t xml:space="preserve">BEFORE collection of data and analysis</w:t>
+        <w:t xml:space="preserve">BEFORE collection of data and</w:t>
+      </w:r>
+      <w:r>
+        <w:rPr>
+          <w:i/>
+          <w:iCs/>
+        </w:rPr>
+        <w:t xml:space="preserve"> </w:t>
+      </w:r>
+      <w:r>
+        <w:rPr>
+          <w:i/>
+          <w:iCs/>
+        </w:rPr>
+        <w:t xml:space="preserve">analysis</w:t>
       </w:r>
     </w:p>
     <w:p>
@@ -1328,7 +1469,13 @@
         <w:pStyle w:val="BodyText"/>
       </w:pPr>
       <w:r>
-        <w:t xml:space="preserve">There is nothing magical about 0.05 - actual p-values need to be reported - also need to decide prior to study</w:t>
+        <w:t xml:space="preserve">There is nothing magical about 0.05 - actual p-values need to be</w:t>
+      </w:r>
+      <w:r>
+        <w:t xml:space="preserve"> </w:t>
+      </w:r>
+      <w:r>
+        <w:t xml:space="preserve">reported - also need to decide prior to study</w:t>
       </w:r>
     </w:p>
     <w:tbl>
@@ -1530,7 +1677,13 @@
         <w:t xml:space="preserve"> </w:t>
       </w:r>
       <w:r>
-        <w:t xml:space="preserve">is the probability of observing the sample result (or something more extreme) if the null hypothesis is true.</w:t>
+        <w:t xml:space="preserve">is the probability of observing the sample result (or</w:t>
+      </w:r>
+      <w:r>
+        <w:t xml:space="preserve"> </w:t>
+      </w:r>
+      <w:r>
+        <w:t xml:space="preserve">something more extreme) if the null hypothesis is true.</w:t>
       </w:r>
     </w:p>
     <w:p>
@@ -1603,6 +1756,7 @@
     </w:p>
     <w:p>
       <w:pPr>
+        <w:pStyle w:val="Compact"/>
         <w:numPr>
           <w:ilvl w:val="1"/>
           <w:numId w:val="1030"/>
@@ -1614,6 +1768,7 @@
     </w:p>
     <w:p>
       <w:pPr>
+        <w:pStyle w:val="Compact"/>
         <w:numPr>
           <w:ilvl w:val="1"/>
           <w:numId w:val="1030"/>
@@ -1625,6 +1780,7 @@
     </w:p>
     <w:p>
       <w:pPr>
+        <w:pStyle w:val="Compact"/>
         <w:numPr>
           <w:ilvl w:val="1"/>
           <w:numId w:val="1030"/>
@@ -1675,7 +1831,7 @@
       <w:r>
         <w:drawing>
           <wp:inline>
-            <wp:extent cx="6578600" cy="6578600"/>
+            <wp:extent cx="4572000" cy="4572000"/>
             <wp:effectExtent b="0" l="0" r="0" t="0"/>
             <wp:docPr descr="" title="" id="49" name="Picture"/>
             <a:graphic>
@@ -1696,7 +1852,7 @@
                   <pic:spPr bwMode="auto">
                     <a:xfrm>
                       <a:off x="0" y="0"/>
-                      <a:ext cx="6578600" cy="6578600"/>
+                      <a:ext cx="4572000" cy="4572000"/>
                     </a:xfrm>
                     <a:prstGeom prst="rect">
                       <a:avLst/>
@@ -1742,7 +1898,7 @@
       <w:r>
         <w:drawing>
           <wp:inline>
-            <wp:extent cx="3810000" cy="2857500"/>
+            <wp:extent cx="4429125" cy="3352800"/>
             <wp:effectExtent b="0" l="0" r="0" t="0"/>
             <wp:docPr descr="" title="" id="53" name="Picture"/>
             <a:graphic>
@@ -1763,7 +1919,7 @@
                   <pic:spPr bwMode="auto">
                     <a:xfrm>
                       <a:off x="0" y="0"/>
-                      <a:ext cx="3810000" cy="2857500"/>
+                      <a:ext cx="4429125" cy="3352800"/>
                     </a:xfrm>
                     <a:prstGeom prst="rect">
                       <a:avLst/>
@@ -1823,7 +1979,25 @@
         <w:pStyle w:val="BodyText"/>
       </w:pPr>
       <w:r>
-        <w:t xml:space="preserve">“If p is between 0.1 and 0.9 there is certainly no reason to suspect the hypothesis tested. If it is below 0.02 it is strongly indicated that the hypothesis fails to account for the whole of the facts. We shall not often be astray if we draw a conventional line at .05 …”</w:t>
+        <w:t xml:space="preserve">“If p is between 0.1 and 0.9 there is certainly no reason to suspect the</w:t>
+      </w:r>
+      <w:r>
+        <w:t xml:space="preserve"> </w:t>
+      </w:r>
+      <w:r>
+        <w:t xml:space="preserve">hypothesis tested. If it is below 0.02 it is strongly indicated that the</w:t>
+      </w:r>
+      <w:r>
+        <w:t xml:space="preserve"> </w:t>
+      </w:r>
+      <w:r>
+        <w:t xml:space="preserve">hypothesis fails to account for the whole of the facts. We shall not</w:t>
+      </w:r>
+      <w:r>
+        <w:t xml:space="preserve"> </w:t>
+      </w:r>
+      <w:r>
+        <w:t xml:space="preserve">often be astray if we draw a conventional line at .05 …”</w:t>
       </w:r>
     </w:p>
     <w:p>
@@ -2087,7 +2261,31 @@
         <w:t xml:space="preserve">Power = 1-β</w:t>
       </w:r>
       <w:r>
-        <w:t xml:space="preserve">: probability of correctly rejecting H₀ when H₁ is true</w:t>
+        <w:t xml:space="preserve">:</w:t>
+      </w:r>
+      <w:r>
+        <w:t xml:space="preserve"> </w:t>
+      </w:r>
+      <w:r>
+        <w:rPr>
+          <w:b/>
+          <w:bCs/>
+        </w:rPr>
+        <w:t xml:space="preserve">probability of correctly rejecting H₀ when H₁ is</w:t>
+      </w:r>
+      <w:r>
+        <w:rPr>
+          <w:b/>
+          <w:bCs/>
+        </w:rPr>
+        <w:t xml:space="preserve"> </w:t>
+      </w:r>
+      <w:r>
+        <w:rPr>
+          <w:b/>
+          <w:bCs/>
+        </w:rPr>
+        <w:t xml:space="preserve">true</w:t>
       </w:r>
     </w:p>
     <w:p>
@@ -2099,7 +2297,13 @@
         </w:numPr>
       </w:pPr>
       <w:r>
-        <w:t xml:space="preserve">Inverse relationship between type I and type II error - but not straightforward</w:t>
+        <w:t xml:space="preserve">Inverse relationship between type I and type II error - but not</w:t>
+      </w:r>
+      <w:r>
+        <w:t xml:space="preserve"> </w:t>
+      </w:r>
+      <w:r>
+        <w:t xml:space="preserve">straightforward</w:t>
       </w:r>
     </w:p>
     <w:p>
@@ -2133,7 +2337,7 @@
       <w:r>
         <w:drawing>
           <wp:inline>
-            <wp:extent cx="3333750" cy="2667000"/>
+            <wp:extent cx="4533900" cy="3400425"/>
             <wp:effectExtent b="0" l="0" r="0" t="0"/>
             <wp:docPr descr="" title="" id="65" name="Picture"/>
             <a:graphic>
@@ -2154,7 +2358,7 @@
                   <pic:spPr bwMode="auto">
                     <a:xfrm>
                       <a:off x="0" y="0"/>
-                      <a:ext cx="3333750" cy="2667000"/>
+                      <a:ext cx="4533900" cy="3400425"/>
                     </a:xfrm>
                     <a:prstGeom prst="rect">
                       <a:avLst/>
@@ -2206,7 +2410,13 @@
         <w:pStyle w:val="FirstParagraph"/>
       </w:pPr>
       <w:r>
-        <w:t xml:space="preserve">When making decisions based on hypothesis tests, two types of errors can occur:</w:t>
+        <w:t xml:space="preserve">When making decisions based on hypothesis tests, two types of errors can</w:t>
+      </w:r>
+      <w:r>
+        <w:t xml:space="preserve"> </w:t>
+      </w:r>
+      <w:r>
+        <w:t xml:space="preserve">occur:</w:t>
       </w:r>
     </w:p>
     <w:p>
@@ -2224,13 +2434,25 @@
         <w:t xml:space="preserve"> </w:t>
       </w:r>
       <w:r>
-        <w:t xml:space="preserve">- Rejecting H₀ when it’s actually true - Probability = α (significance level) -</w:t>
-      </w:r>
-      <w:r>
-        <w:t xml:space="preserve"> </w:t>
-      </w:r>
-      <w:r>
-        <w:t xml:space="preserve">“Finding an effect that isn’t real”</w:t>
+        <w:t xml:space="preserve">- Rejecting H₀ when it’s actually</w:t>
+      </w:r>
+      <w:r>
+        <w:t xml:space="preserve"> </w:t>
+      </w:r>
+      <w:r>
+        <w:t xml:space="preserve">true - Probability = α (significance level) -</w:t>
+      </w:r>
+      <w:r>
+        <w:t xml:space="preserve"> </w:t>
+      </w:r>
+      <w:r>
+        <w:t xml:space="preserve">“Finding an effect that</w:t>
+      </w:r>
+      <w:r>
+        <w:t xml:space="preserve"> </w:t>
+      </w:r>
+      <w:r>
+        <w:t xml:space="preserve">isn’t real”</w:t>
       </w:r>
     </w:p>
     <w:p>
@@ -2248,7 +2470,13 @@
         <w:t xml:space="preserve"> </w:t>
       </w:r>
       <w:r>
-        <w:t xml:space="preserve">- Failing to reject H₀ when it’s actually false - Probability = β -</w:t>
+        <w:t xml:space="preserve">- Failing to reject H₀ when it’s</w:t>
+      </w:r>
+      <w:r>
+        <w:t xml:space="preserve"> </w:t>
+      </w:r>
+      <w:r>
+        <w:t xml:space="preserve">actually false - Probability = β -</w:t>
       </w:r>
       <w:r>
         <w:t xml:space="preserve"> </w:t>
@@ -2272,7 +2500,19 @@
         <w:t xml:space="preserve"> </w:t>
       </w:r>
       <w:r>
-        <w:t xml:space="preserve">- Probability of correctly rejecting a false H₀ - Increases with: - Larger sample size - Larger effect size - Lower variability - Higher α level</w:t>
+        <w:t xml:space="preserve">- Probability of correctly rejecting a</w:t>
+      </w:r>
+      <w:r>
+        <w:t xml:space="preserve"> </w:t>
+      </w:r>
+      <w:r>
+        <w:t xml:space="preserve">false H₀ - Increases with: - Larger sample size - Larger effect size -</w:t>
+      </w:r>
+      <w:r>
+        <w:t xml:space="preserve"> </w:t>
+      </w:r>
+      <w:r>
+        <w:t xml:space="preserve">Lower variability - Higher α level</w:t>
       </w:r>
     </w:p>
     <w:p>
@@ -2288,7 +2528,13 @@
         <w:pStyle w:val="BodyText"/>
       </w:pPr>
       <w:r>
-        <w:t xml:space="preserve">The farther apart the means the lower the beta error is… or you have higher power.</w:t>
+        <w:t xml:space="preserve">The farther apart the means the lower the beta error is… or you have</w:t>
+      </w:r>
+      <w:r>
+        <w:t xml:space="preserve"> </w:t>
+      </w:r>
+      <w:r>
+        <w:t xml:space="preserve">higher power.</w:t>
       </w:r>
     </w:p>
     <w:p>
@@ -2363,7 +2609,13 @@
         <w:pStyle w:val="FirstParagraph"/>
       </w:pPr>
       <w:r>
-        <w:t xml:space="preserve">When making decisions based on hypothesis tests, two types of errors can occur:</w:t>
+        <w:t xml:space="preserve">When making decisions based on hypothesis tests, two types of errors can</w:t>
+      </w:r>
+      <w:r>
+        <w:t xml:space="preserve"> </w:t>
+      </w:r>
+      <w:r>
+        <w:t xml:space="preserve">occur:</w:t>
       </w:r>
     </w:p>
     <w:p>
@@ -2381,13 +2633,25 @@
         <w:t xml:space="preserve"> </w:t>
       </w:r>
       <w:r>
-        <w:t xml:space="preserve">- Rejecting H₀ when it’s actually true - Probability = α (significance level) -</w:t>
-      </w:r>
-      <w:r>
-        <w:t xml:space="preserve"> </w:t>
-      </w:r>
-      <w:r>
-        <w:t xml:space="preserve">“Finding an effect that isn’t real”</w:t>
+        <w:t xml:space="preserve">- Rejecting H₀ when it’s actually</w:t>
+      </w:r>
+      <w:r>
+        <w:t xml:space="preserve"> </w:t>
+      </w:r>
+      <w:r>
+        <w:t xml:space="preserve">true - Probability = α (significance level) -</w:t>
+      </w:r>
+      <w:r>
+        <w:t xml:space="preserve"> </w:t>
+      </w:r>
+      <w:r>
+        <w:t xml:space="preserve">“Finding an effect that</w:t>
+      </w:r>
+      <w:r>
+        <w:t xml:space="preserve"> </w:t>
+      </w:r>
+      <w:r>
+        <w:t xml:space="preserve">isn’t real”</w:t>
       </w:r>
     </w:p>
     <w:p>
@@ -2405,7 +2669,13 @@
         <w:t xml:space="preserve"> </w:t>
       </w:r>
       <w:r>
-        <w:t xml:space="preserve">- Failing to reject H₀ when it’s actually false - Probability = β -</w:t>
+        <w:t xml:space="preserve">- Failing to reject H₀ when it’s</w:t>
+      </w:r>
+      <w:r>
+        <w:t xml:space="preserve"> </w:t>
+      </w:r>
+      <w:r>
+        <w:t xml:space="preserve">actually false - Probability = β -</w:t>
       </w:r>
       <w:r>
         <w:t xml:space="preserve"> </w:t>
@@ -2429,7 +2699,19 @@
         <w:t xml:space="preserve"> </w:t>
       </w:r>
       <w:r>
-        <w:t xml:space="preserve">- Probability of correctly rejecting a false H₀ - Increases with: - Larger sample size - Larger effect size - Lower variability - Higher α level</w:t>
+        <w:t xml:space="preserve">- Probability of correctly rejecting a</w:t>
+      </w:r>
+      <w:r>
+        <w:t xml:space="preserve"> </w:t>
+      </w:r>
+      <w:r>
+        <w:t xml:space="preserve">false H₀ - Increases with: - Larger sample size - Larger effect size -</w:t>
+      </w:r>
+      <w:r>
+        <w:t xml:space="preserve"> </w:t>
+      </w:r>
+      <w:r>
+        <w:t xml:space="preserve">Lower variability - Higher α level</w:t>
       </w:r>
     </w:p>
     <w:p>
@@ -2445,7 +2727,13 @@
         <w:pStyle w:val="BodyText"/>
       </w:pPr>
       <w:r>
-        <w:t xml:space="preserve">The farther apart the means the lower the beta error is… or you have higher power.</w:t>
+        <w:t xml:space="preserve">The farther apart the means the lower the beta error is… or you have</w:t>
+      </w:r>
+      <w:r>
+        <w:t xml:space="preserve"> </w:t>
+      </w:r>
+      <w:r>
+        <w:t xml:space="preserve">higher power.</w:t>
       </w:r>
     </w:p>
     <w:p>
@@ -2455,7 +2743,7 @@
       <w:r>
         <w:drawing>
           <wp:inline>
-            <wp:extent cx="6578600" cy="6578600"/>
+            <wp:extent cx="4572000" cy="4572000"/>
             <wp:effectExtent b="0" l="0" r="0" t="0"/>
             <wp:docPr descr="" title="" id="73" name="Picture"/>
             <a:graphic>
@@ -2476,7 +2764,7 @@
                   <pic:spPr bwMode="auto">
                     <a:xfrm>
                       <a:off x="0" y="0"/>
-                      <a:ext cx="6578600" cy="6578600"/>
+                      <a:ext cx="4572000" cy="4572000"/>
                     </a:xfrm>
                     <a:prstGeom prst="rect">
                       <a:avLst/>
@@ -2615,7 +2903,13 @@
               <w:spacing w:before="16"/>
             </w:pPr>
             <w:r>
-              <w:t xml:space="preserve">Given the following scenarios, identify whether a Type I or Type II error might have occurred:</w:t>
+              <w:t xml:space="preserve">Given the following scenarios, identify whether a Type I or Type II</w:t>
+            </w:r>
+            <w:r>
+              <w:t xml:space="preserve"> </w:t>
+            </w:r>
+            <w:r>
+              <w:t xml:space="preserve">error might have occurred:</w:t>
             </w:r>
           </w:p>
           <w:p>
@@ -2627,7 +2921,13 @@
               </w:numPr>
             </w:pPr>
             <w:r>
-              <w:t xml:space="preserve">A researcher concludes that a new fishing regulation increased grayling size, when in fact it had no effect.</w:t>
+              <w:t xml:space="preserve">A researcher concludes that island mice size is larger, when in fact</w:t>
+            </w:r>
+            <w:r>
+              <w:t xml:space="preserve"> </w:t>
+            </w:r>
+            <w:r>
+              <w:t xml:space="preserve">it is not.</w:t>
             </w:r>
           </w:p>
           <w:p>
@@ -2639,7 +2939,13 @@
               </w:numPr>
             </w:pPr>
             <w:r>
-              <w:t xml:space="preserve">A study fails to detect a real decline in grayling population due to warming water, concluding there was no effect.</w:t>
+              <w:t xml:space="preserve">A study fails to detect a real difference in mouse size on islands</w:t>
+            </w:r>
+            <w:r>
+              <w:t xml:space="preserve"> </w:t>
+            </w:r>
+            <w:r>
+              <w:t xml:space="preserve">when there is and concludes there is no effect.</w:t>
             </w:r>
           </w:p>
           <w:p>
@@ -2651,11 +2957,18 @@
               </w:numPr>
             </w:pPr>
             <w:r>
-              <w:t xml:space="preserve">Let’s calculate the power of our t-test to detect a 30 mm difference in length between lakes:</w:t>
+              <w:t xml:space="preserve">Let’s calculate the power of our t-test to detect a 5 mm difference</w:t>
+            </w:r>
+            <w:r>
+              <w:t xml:space="preserve"> </w:t>
+            </w:r>
+            <w:r>
+              <w:t xml:space="preserve">in mass sampling_sites:</w:t>
             </w:r>
           </w:p>
           <w:p>
             <w:pPr>
+              <w:pStyle w:val="Compact"/>
               <w:numPr>
                 <w:ilvl w:val="0"/>
                 <w:numId w:val="1037"/>
@@ -2674,11 +2987,18 @@
               </w:numPr>
             </w:pPr>
             <w:r>
-              <w:t xml:space="preserve">This is the combined standard deviation of both groups weighted by respective degrees of freedom.</w:t>
+              <w:t xml:space="preserve">This is the combined standard deviation of both groups weighted</w:t>
+            </w:r>
+            <w:r>
+              <w:t xml:space="preserve"> </w:t>
+            </w:r>
+            <w:r>
+              <w:t xml:space="preserve">by respective degrees of freedom.</w:t>
             </w:r>
           </w:p>
           <w:p>
             <w:pPr>
+              <w:pStyle w:val="Compact"/>
               <w:numPr>
                 <w:ilvl w:val="0"/>
                 <w:numId w:val="1037"/>
@@ -2697,7 +3017,13 @@
               </w:numPr>
             </w:pPr>
             <w:r>
-              <w:t xml:space="preserve">standardized difference between means - here assuming a difference of 30 units (mm)</w:t>
+              <w:t xml:space="preserve">standardized difference between means - here assuming a</w:t>
+            </w:r>
+            <w:r>
+              <w:t xml:space="preserve"> </w:t>
+            </w:r>
+            <w:r>
+              <w:t xml:space="preserve">difference of 1 units (g)</w:t>
             </w:r>
           </w:p>
           <w:p>
@@ -2712,7 +3038,7 @@
               <w:rPr>
                 <w:rStyle w:val="VerbatimChar"/>
               </w:rPr>
-              <w:t xml:space="preserve">delta = 0.6741298</w:t>
+              <w:t xml:space="preserve">delta = 0.423</w:t>
             </w:r>
             <w:r>
               <w:t xml:space="preserve">: The standardized effect size (Cohen’s d)</w:t>
@@ -2768,13 +3094,28 @@
               <w:br/>
             </w:r>
             <w:r>
+              <w:rPr>
+                <w:rStyle w:val="FunctionTok"/>
+              </w:rPr>
+              <w:t xml:space="preserve">library</w:t>
+            </w:r>
+            <w:r>
+              <w:rPr>
+                <w:rStyle w:val="NormalTok"/>
+              </w:rPr>
+              <w:t xml:space="preserve">(readxl)</w:t>
+            </w:r>
+            <w:r>
               <w:br/>
             </w:r>
             <w:r>
+              <w:br/>
+            </w:r>
+            <w:r>
               <w:rPr>
                 <w:rStyle w:val="NormalTok"/>
               </w:rPr>
-              <w:t xml:space="preserve">grayling_df </w:t>
+              <w:t xml:space="preserve">m_df </w:t>
             </w:r>
             <w:r>
               <w:rPr>
@@ -2804,12 +3145,132 @@
               <w:rPr>
                 <w:rStyle w:val="StringTok"/>
               </w:rPr>
-              <w:t xml:space="preserve">"data/gray_I3_I8.csv"</w:t>
+              <w:t xml:space="preserve">"data/mice_weights.csv"</w:t>
             </w:r>
             <w:r>
               <w:rPr>
                 <w:rStyle w:val="NormalTok"/>
               </w:rPr>
+              <w:t xml:space="preserve">) </w:t>
+            </w:r>
+            <w:r>
+              <w:rPr>
+                <w:rStyle w:val="SpecialCharTok"/>
+              </w:rPr>
+              <w:t xml:space="preserve">%&gt;%</w:t>
+            </w:r>
+            <w:r>
+              <w:rPr>
+                <w:rStyle w:val="NormalTok"/>
+              </w:rPr>
+              <w:t xml:space="preserve"> </w:t>
+            </w:r>
+            <w:r>
+              <w:br/>
+            </w:r>
+            <w:r>
+              <w:rPr>
+                <w:rStyle w:val="NormalTok"/>
+              </w:rPr>
+              <w:t xml:space="preserve">  </w:t>
+            </w:r>
+            <w:r>
+              <w:rPr>
+                <w:rStyle w:val="FunctionTok"/>
+              </w:rPr>
+              <w:t xml:space="preserve">filter</w:t>
+            </w:r>
+            <w:r>
+              <w:rPr>
+                <w:rStyle w:val="NormalTok"/>
+              </w:rPr>
+              <w:t xml:space="preserve">(</w:t>
+            </w:r>
+            <w:r>
+              <w:rPr>
+                <w:rStyle w:val="SpecialCharTok"/>
+              </w:rPr>
+              <w:t xml:space="preserve">!</w:t>
+            </w:r>
+            <w:r>
+              <w:rPr>
+                <w:rStyle w:val="FunctionTok"/>
+              </w:rPr>
+              <w:t xml:space="preserve">is.na</w:t>
+            </w:r>
+            <w:r>
+              <w:rPr>
+                <w:rStyle w:val="NormalTok"/>
+              </w:rPr>
+              <w:t xml:space="preserve">(mass_g))</w:t>
+            </w:r>
+            <w:r>
+              <w:br/>
+            </w:r>
+            <w:r>
+              <w:br/>
+            </w:r>
+            <w:r>
+              <w:br/>
+            </w:r>
+            <w:r>
+              <w:rPr>
+                <w:rStyle w:val="NormalTok"/>
+              </w:rPr>
+              <w:t xml:space="preserve">sidney_df </w:t>
+            </w:r>
+            <w:r>
+              <w:rPr>
+                <w:rStyle w:val="OtherTok"/>
+              </w:rPr>
+              <w:t xml:space="preserve">&lt;-</w:t>
+            </w:r>
+            <w:r>
+              <w:rPr>
+                <w:rStyle w:val="NormalTok"/>
+              </w:rPr>
+              <w:t xml:space="preserve"> m_df </w:t>
+            </w:r>
+            <w:r>
+              <w:rPr>
+                <w:rStyle w:val="SpecialCharTok"/>
+              </w:rPr>
+              <w:t xml:space="preserve">%&gt;%</w:t>
+            </w:r>
+            <w:r>
+              <w:rPr>
+                <w:rStyle w:val="NormalTok"/>
+              </w:rPr>
+              <w:t xml:space="preserve"> </w:t>
+            </w:r>
+            <w:r>
+              <w:rPr>
+                <w:rStyle w:val="FunctionTok"/>
+              </w:rPr>
+              <w:t xml:space="preserve">filter</w:t>
+            </w:r>
+            <w:r>
+              <w:rPr>
+                <w:rStyle w:val="NormalTok"/>
+              </w:rPr>
+              <w:t xml:space="preserve">(sampling_site</w:t>
+            </w:r>
+            <w:r>
+              <w:rPr>
+                <w:rStyle w:val="SpecialCharTok"/>
+              </w:rPr>
+              <w:t xml:space="preserve">==</w:t>
+            </w:r>
+            <w:r>
+              <w:rPr>
+                <w:rStyle w:val="StringTok"/>
+              </w:rPr>
+              <w:t xml:space="preserve">"Sidney Island"</w:t>
+            </w:r>
+            <w:r>
+              <w:rPr>
+                <w:rStyle w:val="NormalTok"/>
+              </w:rPr>
               <w:t xml:space="preserve">)</w:t>
             </w:r>
             <w:r>
@@ -2819,7 +3280,7 @@
               <w:rPr>
                 <w:rStyle w:val="NormalTok"/>
               </w:rPr>
-              <w:t xml:space="preserve">i3_df </w:t>
+              <w:t xml:space="preserve">vancouver_df </w:t>
             </w:r>
             <w:r>
               <w:rPr>
@@ -2831,7 +3292,7 @@
               <w:rPr>
                 <w:rStyle w:val="NormalTok"/>
               </w:rPr>
-              <w:t xml:space="preserve"> grayling_df </w:t>
+              <w:t xml:space="preserve"> m_df </w:t>
             </w:r>
             <w:r>
               <w:rPr>
@@ -2855,7 +3316,7 @@
               <w:rPr>
                 <w:rStyle w:val="NormalTok"/>
               </w:rPr>
-              <w:t xml:space="preserve">(lake</w:t>
+              <w:t xml:space="preserve">(sampling_site</w:t>
             </w:r>
             <w:r>
               <w:rPr>
@@ -2867,7 +3328,7 @@
               <w:rPr>
                 <w:rStyle w:val="StringTok"/>
               </w:rPr>
-              <w:t xml:space="preserve">"I3"</w:t>
+              <w:t xml:space="preserve">"Vancouver"</w:t>
             </w:r>
             <w:r>
               <w:rPr>
@@ -2880,9 +3341,21 @@
             </w:r>
             <w:r>
               <w:rPr>
+                <w:rStyle w:val="CommentTok"/>
+              </w:rPr>
+              <w:t xml:space="preserve"># Calculate power for detecting a 30 mm difference</w:t>
+            </w:r>
+            <w:r>
+              <w:br/>
+            </w:r>
+            <w:r>
+              <w:br/>
+            </w:r>
+            <w:r>
+              <w:rPr>
                 <w:rStyle w:val="NormalTok"/>
               </w:rPr>
-              <w:t xml:space="preserve">i8_df </w:t>
+              <w:t xml:space="preserve">n1 </w:t>
             </w:r>
             <w:r>
               <w:rPr>
@@ -2894,70 +3367,280 @@
               <w:rPr>
                 <w:rStyle w:val="NormalTok"/>
               </w:rPr>
-              <w:t xml:space="preserve"> grayling_df </w:t>
+              <w:t xml:space="preserve"> </w:t>
+            </w:r>
+            <w:r>
+              <w:rPr>
+                <w:rStyle w:val="FunctionTok"/>
+              </w:rPr>
+              <w:t xml:space="preserve">nrow</w:t>
+            </w:r>
+            <w:r>
+              <w:rPr>
+                <w:rStyle w:val="NormalTok"/>
+              </w:rPr>
+              <w:t xml:space="preserve">(sidney_df)</w:t>
+            </w:r>
+            <w:r>
+              <w:br/>
+            </w:r>
+            <w:r>
+              <w:rPr>
+                <w:rStyle w:val="NormalTok"/>
+              </w:rPr>
+              <w:t xml:space="preserve">n2 </w:t>
+            </w:r>
+            <w:r>
+              <w:rPr>
+                <w:rStyle w:val="OtherTok"/>
+              </w:rPr>
+              <w:t xml:space="preserve">&lt;-</w:t>
+            </w:r>
+            <w:r>
+              <w:rPr>
+                <w:rStyle w:val="NormalTok"/>
+              </w:rPr>
+              <w:t xml:space="preserve"> </w:t>
+            </w:r>
+            <w:r>
+              <w:rPr>
+                <w:rStyle w:val="FunctionTok"/>
+              </w:rPr>
+              <w:t xml:space="preserve">nrow</w:t>
+            </w:r>
+            <w:r>
+              <w:rPr>
+                <w:rStyle w:val="NormalTok"/>
+              </w:rPr>
+              <w:t xml:space="preserve">(vancouver_df)</w:t>
+            </w:r>
+            <w:r>
+              <w:br/>
+            </w:r>
+            <w:r>
+              <w:rPr>
+                <w:rStyle w:val="NormalTok"/>
+              </w:rPr>
+              <w:t xml:space="preserve">sd_pooled </w:t>
+            </w:r>
+            <w:r>
+              <w:rPr>
+                <w:rStyle w:val="OtherTok"/>
+              </w:rPr>
+              <w:t xml:space="preserve">&lt;-</w:t>
+            </w:r>
+            <w:r>
+              <w:rPr>
+                <w:rStyle w:val="NormalTok"/>
+              </w:rPr>
+              <w:t xml:space="preserve"> </w:t>
+            </w:r>
+            <w:r>
+              <w:rPr>
+                <w:rStyle w:val="FunctionTok"/>
+              </w:rPr>
+              <w:t xml:space="preserve">sqrt</w:t>
+            </w:r>
+            <w:r>
+              <w:rPr>
+                <w:rStyle w:val="NormalTok"/>
+              </w:rPr>
+              <w:t xml:space="preserve">((</w:t>
+            </w:r>
+            <w:r>
+              <w:rPr>
+                <w:rStyle w:val="FunctionTok"/>
+              </w:rPr>
+              <w:t xml:space="preserve">var</w:t>
+            </w:r>
+            <w:r>
+              <w:rPr>
+                <w:rStyle w:val="NormalTok"/>
+              </w:rPr>
+              <w:t xml:space="preserve">(sidney_df</w:t>
             </w:r>
             <w:r>
               <w:rPr>
                 <w:rStyle w:val="SpecialCharTok"/>
               </w:rPr>
-              <w:t xml:space="preserve">%&gt;%</w:t>
+              <w:t xml:space="preserve">$</w:t>
             </w:r>
             <w:r>
               <w:rPr>
                 <w:rStyle w:val="NormalTok"/>
               </w:rPr>
+              <w:t xml:space="preserve">mass_g) </w:t>
+            </w:r>
+            <w:r>
+              <w:rPr>
+                <w:rStyle w:val="SpecialCharTok"/>
+              </w:rPr>
+              <w:t xml:space="preserve">*</w:t>
+            </w:r>
+            <w:r>
+              <w:rPr>
+                <w:rStyle w:val="NormalTok"/>
+              </w:rPr>
+              <w:t xml:space="preserve"> (n1</w:t>
+            </w:r>
+            <w:r>
+              <w:rPr>
+                <w:rStyle w:val="DecValTok"/>
+              </w:rPr>
+              <w:t xml:space="preserve">-1</w:t>
+            </w:r>
+            <w:r>
+              <w:rPr>
+                <w:rStyle w:val="NormalTok"/>
+              </w:rPr>
+              <w:t xml:space="preserve">) </w:t>
+            </w:r>
+            <w:r>
+              <w:rPr>
+                <w:rStyle w:val="SpecialCharTok"/>
+              </w:rPr>
+              <w:t xml:space="preserve">+</w:t>
+            </w:r>
+            <w:r>
+              <w:rPr>
+                <w:rStyle w:val="NormalTok"/>
+              </w:rPr>
               <w:t xml:space="preserve"> </w:t>
             </w:r>
             <w:r>
+              <w:br/>
+            </w:r>
+            <w:r>
+              <w:rPr>
+                <w:rStyle w:val="NormalTok"/>
+              </w:rPr>
+              <w:t xml:space="preserve">                  </w:t>
+            </w:r>
+            <w:r>
               <w:rPr>
                 <w:rStyle w:val="FunctionTok"/>
               </w:rPr>
-              <w:t xml:space="preserve">filter</w:t>
+              <w:t xml:space="preserve">var</w:t>
             </w:r>
             <w:r>
               <w:rPr>
                 <w:rStyle w:val="NormalTok"/>
               </w:rPr>
-              <w:t xml:space="preserve">(lake</w:t>
+              <w:t xml:space="preserve">(vancouver_df</w:t>
             </w:r>
             <w:r>
               <w:rPr>
                 <w:rStyle w:val="SpecialCharTok"/>
               </w:rPr>
-              <w:t xml:space="preserve">==</w:t>
-            </w:r>
-            <w:r>
-              <w:rPr>
-                <w:rStyle w:val="StringTok"/>
-              </w:rPr>
-              <w:t xml:space="preserve">"I8"</w:t>
+              <w:t xml:space="preserve">$</w:t>
             </w:r>
             <w:r>
               <w:rPr>
                 <w:rStyle w:val="NormalTok"/>
               </w:rPr>
-              <w:t xml:space="preserve">)</w:t>
+              <w:t xml:space="preserve">mass_g) </w:t>
+            </w:r>
+            <w:r>
+              <w:rPr>
+                <w:rStyle w:val="SpecialCharTok"/>
+              </w:rPr>
+              <w:t xml:space="preserve">*</w:t>
+            </w:r>
+            <w:r>
+              <w:rPr>
+                <w:rStyle w:val="NormalTok"/>
+              </w:rPr>
+              <w:t xml:space="preserve"> (n2</w:t>
+            </w:r>
+            <w:r>
+              <w:rPr>
+                <w:rStyle w:val="DecValTok"/>
+              </w:rPr>
+              <w:t xml:space="preserve">-1</w:t>
+            </w:r>
+            <w:r>
+              <w:rPr>
+                <w:rStyle w:val="NormalTok"/>
+              </w:rPr>
+              <w:t xml:space="preserve">)) </w:t>
+            </w:r>
+            <w:r>
+              <w:rPr>
+                <w:rStyle w:val="SpecialCharTok"/>
+              </w:rPr>
+              <w:t xml:space="preserve">/</w:t>
+            </w:r>
+            <w:r>
+              <w:rPr>
+                <w:rStyle w:val="NormalTok"/>
+              </w:rPr>
+              <w:t xml:space="preserve"> </w:t>
             </w:r>
             <w:r>
               <w:br/>
             </w:r>
             <w:r>
               <w:rPr>
+                <w:rStyle w:val="NormalTok"/>
+              </w:rPr>
+              <w:t xml:space="preserve">                  (n1 </w:t>
+            </w:r>
+            <w:r>
+              <w:rPr>
+                <w:rStyle w:val="SpecialCharTok"/>
+              </w:rPr>
+              <w:t xml:space="preserve">+</w:t>
+            </w:r>
+            <w:r>
+              <w:rPr>
+                <w:rStyle w:val="NormalTok"/>
+              </w:rPr>
+              <w:t xml:space="preserve"> n2 </w:t>
+            </w:r>
+            <w:r>
+              <w:rPr>
+                <w:rStyle w:val="SpecialCharTok"/>
+              </w:rPr>
+              <w:t xml:space="preserve">-</w:t>
+            </w:r>
+            <w:r>
+              <w:rPr>
+                <w:rStyle w:val="NormalTok"/>
+              </w:rPr>
+              <w:t xml:space="preserve"> </w:t>
+            </w:r>
+            <w:r>
+              <w:rPr>
+                <w:rStyle w:val="DecValTok"/>
+              </w:rPr>
+              <w:t xml:space="preserve">2</w:t>
+            </w:r>
+            <w:r>
+              <w:rPr>
+                <w:rStyle w:val="NormalTok"/>
+              </w:rPr>
+              <w:t xml:space="preserve">))</w:t>
+            </w:r>
+            <w:r>
+              <w:br/>
+            </w:r>
+            <w:r>
+              <w:br/>
+            </w:r>
+            <w:r>
+              <w:rPr>
                 <w:rStyle w:val="CommentTok"/>
               </w:rPr>
-              <w:t xml:space="preserve"># Calculate power for detecting a 30 mm difference</w:t>
+              <w:t xml:space="preserve"># Calculate power</w:t>
             </w:r>
             <w:r>
               <w:br/>
             </w:r>
             <w:r>
-              <w:br/>
-            </w:r>
-            <w:r>
               <w:rPr>
                 <w:rStyle w:val="NormalTok"/>
               </w:rPr>
-              <w:t xml:space="preserve">n1 </w:t>
+              <w:t xml:space="preserve">effect_size </w:t>
             </w:r>
             <w:r>
               <w:rPr>
@@ -2973,294 +3656,9 @@
             </w:r>
             <w:r>
               <w:rPr>
-                <w:rStyle w:val="FunctionTok"/>
-              </w:rPr>
-              <w:t xml:space="preserve">nrow</w:t>
-            </w:r>
-            <w:r>
-              <w:rPr>
-                <w:rStyle w:val="NormalTok"/>
-              </w:rPr>
-              <w:t xml:space="preserve">(i3_df)</w:t>
-            </w:r>
-            <w:r>
-              <w:br/>
-            </w:r>
-            <w:r>
-              <w:rPr>
-                <w:rStyle w:val="NormalTok"/>
-              </w:rPr>
-              <w:t xml:space="preserve">n2 </w:t>
-            </w:r>
-            <w:r>
-              <w:rPr>
-                <w:rStyle w:val="OtherTok"/>
-              </w:rPr>
-              <w:t xml:space="preserve">&lt;-</w:t>
-            </w:r>
-            <w:r>
-              <w:rPr>
-                <w:rStyle w:val="NormalTok"/>
-              </w:rPr>
-              <w:t xml:space="preserve"> </w:t>
-            </w:r>
-            <w:r>
-              <w:rPr>
-                <w:rStyle w:val="FunctionTok"/>
-              </w:rPr>
-              <w:t xml:space="preserve">nrow</w:t>
-            </w:r>
-            <w:r>
-              <w:rPr>
-                <w:rStyle w:val="NormalTok"/>
-              </w:rPr>
-              <w:t xml:space="preserve">(i8_df)</w:t>
-            </w:r>
-            <w:r>
-              <w:br/>
-            </w:r>
-            <w:r>
-              <w:rPr>
-                <w:rStyle w:val="NormalTok"/>
-              </w:rPr>
-              <w:t xml:space="preserve">sd_pooled </w:t>
-            </w:r>
-            <w:r>
-              <w:rPr>
-                <w:rStyle w:val="OtherTok"/>
-              </w:rPr>
-              <w:t xml:space="preserve">&lt;-</w:t>
-            </w:r>
-            <w:r>
-              <w:rPr>
-                <w:rStyle w:val="NormalTok"/>
-              </w:rPr>
-              <w:t xml:space="preserve"> </w:t>
-            </w:r>
-            <w:r>
-              <w:rPr>
-                <w:rStyle w:val="FunctionTok"/>
-              </w:rPr>
-              <w:t xml:space="preserve">sqrt</w:t>
-            </w:r>
-            <w:r>
-              <w:rPr>
-                <w:rStyle w:val="NormalTok"/>
-              </w:rPr>
-              <w:t xml:space="preserve">((</w:t>
-            </w:r>
-            <w:r>
-              <w:rPr>
-                <w:rStyle w:val="FunctionTok"/>
-              </w:rPr>
-              <w:t xml:space="preserve">var</w:t>
-            </w:r>
-            <w:r>
-              <w:rPr>
-                <w:rStyle w:val="NormalTok"/>
-              </w:rPr>
-              <w:t xml:space="preserve">(i3_df</w:t>
-            </w:r>
-            <w:r>
-              <w:rPr>
-                <w:rStyle w:val="SpecialCharTok"/>
-              </w:rPr>
-              <w:t xml:space="preserve">$</w:t>
-            </w:r>
-            <w:r>
-              <w:rPr>
-                <w:rStyle w:val="NormalTok"/>
-              </w:rPr>
-              <w:t xml:space="preserve">length_mm) </w:t>
-            </w:r>
-            <w:r>
-              <w:rPr>
-                <w:rStyle w:val="SpecialCharTok"/>
-              </w:rPr>
-              <w:t xml:space="preserve">*</w:t>
-            </w:r>
-            <w:r>
-              <w:rPr>
-                <w:rStyle w:val="NormalTok"/>
-              </w:rPr>
-              <w:t xml:space="preserve"> (n1</w:t>
-            </w:r>
-            <w:r>
-              <w:rPr>
                 <w:rStyle w:val="DecValTok"/>
               </w:rPr>
-              <w:t xml:space="preserve">-1</w:t>
-            </w:r>
-            <w:r>
-              <w:rPr>
-                <w:rStyle w:val="NormalTok"/>
-              </w:rPr>
-              <w:t xml:space="preserve">) </w:t>
-            </w:r>
-            <w:r>
-              <w:rPr>
-                <w:rStyle w:val="SpecialCharTok"/>
-              </w:rPr>
-              <w:t xml:space="preserve">+</w:t>
-            </w:r>
-            <w:r>
-              <w:rPr>
-                <w:rStyle w:val="NormalTok"/>
-              </w:rPr>
-              <w:t xml:space="preserve"> </w:t>
-            </w:r>
-            <w:r>
-              <w:br/>
-            </w:r>
-            <w:r>
-              <w:rPr>
-                <w:rStyle w:val="NormalTok"/>
-              </w:rPr>
-              <w:t xml:space="preserve">                  </w:t>
-            </w:r>
-            <w:r>
-              <w:rPr>
-                <w:rStyle w:val="FunctionTok"/>
-              </w:rPr>
-              <w:t xml:space="preserve">var</w:t>
-            </w:r>
-            <w:r>
-              <w:rPr>
-                <w:rStyle w:val="NormalTok"/>
-              </w:rPr>
-              <w:t xml:space="preserve">(i8_df</w:t>
-            </w:r>
-            <w:r>
-              <w:rPr>
-                <w:rStyle w:val="SpecialCharTok"/>
-              </w:rPr>
-              <w:t xml:space="preserve">$</w:t>
-            </w:r>
-            <w:r>
-              <w:rPr>
-                <w:rStyle w:val="NormalTok"/>
-              </w:rPr>
-              <w:t xml:space="preserve">length_mm) </w:t>
-            </w:r>
-            <w:r>
-              <w:rPr>
-                <w:rStyle w:val="SpecialCharTok"/>
-              </w:rPr>
-              <w:t xml:space="preserve">*</w:t>
-            </w:r>
-            <w:r>
-              <w:rPr>
-                <w:rStyle w:val="NormalTok"/>
-              </w:rPr>
-              <w:t xml:space="preserve"> (n2</w:t>
-            </w:r>
-            <w:r>
-              <w:rPr>
-                <w:rStyle w:val="DecValTok"/>
-              </w:rPr>
-              <w:t xml:space="preserve">-1</w:t>
-            </w:r>
-            <w:r>
-              <w:rPr>
-                <w:rStyle w:val="NormalTok"/>
-              </w:rPr>
-              <w:t xml:space="preserve">)) </w:t>
-            </w:r>
-            <w:r>
-              <w:rPr>
-                <w:rStyle w:val="SpecialCharTok"/>
-              </w:rPr>
-              <w:t xml:space="preserve">/</w:t>
-            </w:r>
-            <w:r>
-              <w:rPr>
-                <w:rStyle w:val="NormalTok"/>
-              </w:rPr>
-              <w:t xml:space="preserve"> </w:t>
-            </w:r>
-            <w:r>
-              <w:br/>
-            </w:r>
-            <w:r>
-              <w:rPr>
-                <w:rStyle w:val="NormalTok"/>
-              </w:rPr>
-              <w:t xml:space="preserve">                  (n1 </w:t>
-            </w:r>
-            <w:r>
-              <w:rPr>
-                <w:rStyle w:val="SpecialCharTok"/>
-              </w:rPr>
-              <w:t xml:space="preserve">+</w:t>
-            </w:r>
-            <w:r>
-              <w:rPr>
-                <w:rStyle w:val="NormalTok"/>
-              </w:rPr>
-              <w:t xml:space="preserve"> n2 </w:t>
-            </w:r>
-            <w:r>
-              <w:rPr>
-                <w:rStyle w:val="SpecialCharTok"/>
-              </w:rPr>
-              <w:t xml:space="preserve">-</w:t>
-            </w:r>
-            <w:r>
-              <w:rPr>
-                <w:rStyle w:val="NormalTok"/>
-              </w:rPr>
-              <w:t xml:space="preserve"> </w:t>
-            </w:r>
-            <w:r>
-              <w:rPr>
-                <w:rStyle w:val="DecValTok"/>
-              </w:rPr>
-              <w:t xml:space="preserve">2</w:t>
-            </w:r>
-            <w:r>
-              <w:rPr>
-                <w:rStyle w:val="NormalTok"/>
-              </w:rPr>
-              <w:t xml:space="preserve">))</w:t>
-            </w:r>
-            <w:r>
-              <w:br/>
-            </w:r>
-            <w:r>
-              <w:br/>
-            </w:r>
-            <w:r>
-              <w:rPr>
-                <w:rStyle w:val="CommentTok"/>
-              </w:rPr>
-              <w:t xml:space="preserve"># Calculate power</w:t>
-            </w:r>
-            <w:r>
-              <w:br/>
-            </w:r>
-            <w:r>
-              <w:rPr>
-                <w:rStyle w:val="NormalTok"/>
-              </w:rPr>
-              <w:t xml:space="preserve">effect_size </w:t>
-            </w:r>
-            <w:r>
-              <w:rPr>
-                <w:rStyle w:val="OtherTok"/>
-              </w:rPr>
-              <w:t xml:space="preserve">&lt;-</w:t>
-            </w:r>
-            <w:r>
-              <w:rPr>
-                <w:rStyle w:val="NormalTok"/>
-              </w:rPr>
-              <w:t xml:space="preserve"> </w:t>
-            </w:r>
-            <w:r>
-              <w:rPr>
-                <w:rStyle w:val="DecValTok"/>
-              </w:rPr>
-              <w:t xml:space="preserve">30</w:t>
+              <w:t xml:space="preserve">1</w:t>
             </w:r>
             <w:r>
               <w:rPr>
@@ -3613,7 +4011,7 @@
               <w:rPr>
                 <w:rStyle w:val="VerbatimChar"/>
               </w:rPr>
-              <w:t xml:space="preserve">              n = 66</w:t>
+              <w:t xml:space="preserve">              n = 28</w:t>
             </w:r>
             <w:r>
               <w:br/>
@@ -3622,7 +4020,7 @@
               <w:rPr>
                 <w:rStyle w:val="VerbatimChar"/>
               </w:rPr>
-              <w:t xml:space="preserve">          delta = 0.6741298</w:t>
+              <w:t xml:space="preserve">          delta = 0.4231154</w:t>
             </w:r>
             <w:r>
               <w:br/>
@@ -3649,7 +4047,7 @@
               <w:rPr>
                 <w:rStyle w:val="VerbatimChar"/>
               </w:rPr>
-              <w:t xml:space="preserve">          power = 0.9702076</w:t>
+              <w:t xml:space="preserve">          power = 0.3427604</w:t>
             </w:r>
             <w:r>
               <w:br/>
@@ -3677,12 +4075,1393 @@
       </w:tr>
     </w:tbl>
     <w:bookmarkEnd w:id="79"/>
-    <w:bookmarkStart w:id="80" w:name="what-is-power"/>
+    <w:bookmarkStart w:id="80" w:name="X8762ddb6e1d8be1a4f0e2f2bfb71a85d56cba20"/>
     <w:p>
       <w:pPr>
         <w:pStyle w:val="Heading1"/>
       </w:pPr>
       <w:r>
+        <w:t xml:space="preserve">What if we calculated power for the pine needles you measured?</w:t>
+      </w:r>
+    </w:p>
+    <w:p>
+      <w:pPr>
+        <w:pStyle w:val="SourceCode"/>
+      </w:pPr>
+      <w:r>
+        <w:rPr>
+          <w:rStyle w:val="NormalTok"/>
+        </w:rPr>
+        <w:t xml:space="preserve">pine_switch_df </w:t>
+      </w:r>
+      <w:r>
+        <w:rPr>
+          <w:rStyle w:val="OtherTok"/>
+        </w:rPr>
+        <w:t xml:space="preserve">&lt;-</w:t>
+      </w:r>
+      <w:r>
+        <w:rPr>
+          <w:rStyle w:val="NormalTok"/>
+        </w:rPr>
+        <w:t xml:space="preserve"> </w:t>
+      </w:r>
+      <w:r>
+        <w:rPr>
+          <w:rStyle w:val="FunctionTok"/>
+        </w:rPr>
+        <w:t xml:space="preserve">read_excel</w:t>
+      </w:r>
+      <w:r>
+        <w:rPr>
+          <w:rStyle w:val="NormalTok"/>
+        </w:rPr>
+        <w:t xml:space="preserve">(</w:t>
+      </w:r>
+      <w:r>
+        <w:rPr>
+          <w:rStyle w:val="StringTok"/>
+        </w:rPr>
+        <w:t xml:space="preserve">"data/class_pine needle length switched.xlsx"</w:t>
+      </w:r>
+      <w:r>
+        <w:rPr>
+          <w:rStyle w:val="NormalTok"/>
+        </w:rPr>
+        <w:t xml:space="preserve">)</w:t>
+      </w:r>
+      <w:r>
+        <w:br/>
+      </w:r>
+      <w:r>
+        <w:rPr>
+          <w:rStyle w:val="NormalTok"/>
+        </w:rPr>
+        <w:t xml:space="preserve">ps_df </w:t>
+      </w:r>
+      <w:r>
+        <w:rPr>
+          <w:rStyle w:val="OtherTok"/>
+        </w:rPr>
+        <w:t xml:space="preserve">&lt;-</w:t>
+      </w:r>
+      <w:r>
+        <w:rPr>
+          <w:rStyle w:val="NormalTok"/>
+        </w:rPr>
+        <w:t xml:space="preserve"> pine_switch_df </w:t>
+      </w:r>
+      <w:r>
+        <w:rPr>
+          <w:rStyle w:val="SpecialCharTok"/>
+        </w:rPr>
+        <w:t xml:space="preserve">%&gt;%</w:t>
+      </w:r>
+      <w:r>
+        <w:rPr>
+          <w:rStyle w:val="NormalTok"/>
+        </w:rPr>
+        <w:t xml:space="preserve"> </w:t>
+      </w:r>
+      <w:r>
+        <w:br/>
+      </w:r>
+      <w:r>
+        <w:rPr>
+          <w:rStyle w:val="NormalTok"/>
+        </w:rPr>
+        <w:t xml:space="preserve">  </w:t>
+      </w:r>
+      <w:r>
+        <w:rPr>
+          <w:rStyle w:val="FunctionTok"/>
+        </w:rPr>
+        <w:t xml:space="preserve">group_by</w:t>
+      </w:r>
+      <w:r>
+        <w:rPr>
+          <w:rStyle w:val="NormalTok"/>
+        </w:rPr>
+        <w:t xml:space="preserve">(group, tree_no, tree_char, side) </w:t>
+      </w:r>
+      <w:r>
+        <w:rPr>
+          <w:rStyle w:val="SpecialCharTok"/>
+        </w:rPr>
+        <w:t xml:space="preserve">%&gt;%</w:t>
+      </w:r>
+      <w:r>
+        <w:rPr>
+          <w:rStyle w:val="NormalTok"/>
+        </w:rPr>
+        <w:t xml:space="preserve"> </w:t>
+      </w:r>
+      <w:r>
+        <w:br/>
+      </w:r>
+      <w:r>
+        <w:rPr>
+          <w:rStyle w:val="NormalTok"/>
+        </w:rPr>
+        <w:t xml:space="preserve">  </w:t>
+      </w:r>
+      <w:r>
+        <w:rPr>
+          <w:rStyle w:val="FunctionTok"/>
+        </w:rPr>
+        <w:t xml:space="preserve">summarise</w:t>
+      </w:r>
+      <w:r>
+        <w:rPr>
+          <w:rStyle w:val="NormalTok"/>
+        </w:rPr>
+        <w:t xml:space="preserve">(</w:t>
+      </w:r>
+      <w:r>
+        <w:rPr>
+          <w:rStyle w:val="AttributeTok"/>
+        </w:rPr>
+        <w:t xml:space="preserve">length_mm =</w:t>
+      </w:r>
+      <w:r>
+        <w:rPr>
+          <w:rStyle w:val="NormalTok"/>
+        </w:rPr>
+        <w:t xml:space="preserve"> </w:t>
+      </w:r>
+      <w:r>
+        <w:rPr>
+          <w:rStyle w:val="FunctionTok"/>
+        </w:rPr>
+        <w:t xml:space="preserve">mean</w:t>
+      </w:r>
+      <w:r>
+        <w:rPr>
+          <w:rStyle w:val="NormalTok"/>
+        </w:rPr>
+        <w:t xml:space="preserve">(length_mm, </w:t>
+      </w:r>
+      <w:r>
+        <w:rPr>
+          <w:rStyle w:val="AttributeTok"/>
+        </w:rPr>
+        <w:t xml:space="preserve">na.rm=</w:t>
+      </w:r>
+      <w:r>
+        <w:rPr>
+          <w:rStyle w:val="ConstantTok"/>
+        </w:rPr>
+        <w:t xml:space="preserve">TRUE</w:t>
+      </w:r>
+      <w:r>
+        <w:rPr>
+          <w:rStyle w:val="NormalTok"/>
+        </w:rPr>
+        <w:t xml:space="preserve">))</w:t>
+      </w:r>
+      <w:r>
+        <w:br/>
+      </w:r>
+      <w:r>
+        <w:br/>
+      </w:r>
+      <w:r>
+        <w:rPr>
+          <w:rStyle w:val="NormalTok"/>
+        </w:rPr>
+        <w:t xml:space="preserve">ps_shady_df </w:t>
+      </w:r>
+      <w:r>
+        <w:rPr>
+          <w:rStyle w:val="OtherTok"/>
+        </w:rPr>
+        <w:t xml:space="preserve">&lt;-</w:t>
+      </w:r>
+      <w:r>
+        <w:rPr>
+          <w:rStyle w:val="NormalTok"/>
+        </w:rPr>
+        <w:t xml:space="preserve"> ps_df </w:t>
+      </w:r>
+      <w:r>
+        <w:rPr>
+          <w:rStyle w:val="SpecialCharTok"/>
+        </w:rPr>
+        <w:t xml:space="preserve">%&gt;%</w:t>
+      </w:r>
+      <w:r>
+        <w:rPr>
+          <w:rStyle w:val="NormalTok"/>
+        </w:rPr>
+        <w:t xml:space="preserve"> </w:t>
+      </w:r>
+      <w:r>
+        <w:br/>
+      </w:r>
+      <w:r>
+        <w:rPr>
+          <w:rStyle w:val="NormalTok"/>
+        </w:rPr>
+        <w:t xml:space="preserve">  </w:t>
+      </w:r>
+      <w:r>
+        <w:rPr>
+          <w:rStyle w:val="FunctionTok"/>
+        </w:rPr>
+        <w:t xml:space="preserve">filter</w:t>
+      </w:r>
+      <w:r>
+        <w:rPr>
+          <w:rStyle w:val="NormalTok"/>
+        </w:rPr>
+        <w:t xml:space="preserve">(side </w:t>
+      </w:r>
+      <w:r>
+        <w:rPr>
+          <w:rStyle w:val="SpecialCharTok"/>
+        </w:rPr>
+        <w:t xml:space="preserve">==</w:t>
+      </w:r>
+      <w:r>
+        <w:rPr>
+          <w:rStyle w:val="NormalTok"/>
+        </w:rPr>
+        <w:t xml:space="preserve"> </w:t>
+      </w:r>
+      <w:r>
+        <w:rPr>
+          <w:rStyle w:val="StringTok"/>
+        </w:rPr>
+        <w:t xml:space="preserve">"shady"</w:t>
+      </w:r>
+      <w:r>
+        <w:rPr>
+          <w:rStyle w:val="NormalTok"/>
+        </w:rPr>
+        <w:t xml:space="preserve">)</w:t>
+      </w:r>
+      <w:r>
+        <w:br/>
+      </w:r>
+      <w:r>
+        <w:br/>
+      </w:r>
+      <w:r>
+        <w:rPr>
+          <w:rStyle w:val="NormalTok"/>
+        </w:rPr>
+        <w:t xml:space="preserve">ps_sunny_df </w:t>
+      </w:r>
+      <w:r>
+        <w:rPr>
+          <w:rStyle w:val="OtherTok"/>
+        </w:rPr>
+        <w:t xml:space="preserve">&lt;-</w:t>
+      </w:r>
+      <w:r>
+        <w:rPr>
+          <w:rStyle w:val="NormalTok"/>
+        </w:rPr>
+        <w:t xml:space="preserve"> ps_df </w:t>
+      </w:r>
+      <w:r>
+        <w:rPr>
+          <w:rStyle w:val="SpecialCharTok"/>
+        </w:rPr>
+        <w:t xml:space="preserve">%&gt;%</w:t>
+      </w:r>
+      <w:r>
+        <w:rPr>
+          <w:rStyle w:val="NormalTok"/>
+        </w:rPr>
+        <w:t xml:space="preserve"> </w:t>
+      </w:r>
+      <w:r>
+        <w:br/>
+      </w:r>
+      <w:r>
+        <w:rPr>
+          <w:rStyle w:val="NormalTok"/>
+        </w:rPr>
+        <w:t xml:space="preserve">  </w:t>
+      </w:r>
+      <w:r>
+        <w:rPr>
+          <w:rStyle w:val="FunctionTok"/>
+        </w:rPr>
+        <w:t xml:space="preserve">filter</w:t>
+      </w:r>
+      <w:r>
+        <w:rPr>
+          <w:rStyle w:val="NormalTok"/>
+        </w:rPr>
+        <w:t xml:space="preserve">(side </w:t>
+      </w:r>
+      <w:r>
+        <w:rPr>
+          <w:rStyle w:val="SpecialCharTok"/>
+        </w:rPr>
+        <w:t xml:space="preserve">==</w:t>
+      </w:r>
+      <w:r>
+        <w:rPr>
+          <w:rStyle w:val="NormalTok"/>
+        </w:rPr>
+        <w:t xml:space="preserve"> </w:t>
+      </w:r>
+      <w:r>
+        <w:rPr>
+          <w:rStyle w:val="StringTok"/>
+        </w:rPr>
+        <w:t xml:space="preserve">"sunny"</w:t>
+      </w:r>
+      <w:r>
+        <w:rPr>
+          <w:rStyle w:val="NormalTok"/>
+        </w:rPr>
+        <w:t xml:space="preserve">)</w:t>
+      </w:r>
+      <w:r>
+        <w:br/>
+      </w:r>
+      <w:r>
+        <w:br/>
+      </w:r>
+      <w:r>
+        <w:rPr>
+          <w:rStyle w:val="NormalTok"/>
+        </w:rPr>
+        <w:t xml:space="preserve">pine_alpha </w:t>
+      </w:r>
+      <w:r>
+        <w:rPr>
+          <w:rStyle w:val="OtherTok"/>
+        </w:rPr>
+        <w:t xml:space="preserve">&lt;-</w:t>
+      </w:r>
+      <w:r>
+        <w:rPr>
+          <w:rStyle w:val="NormalTok"/>
+        </w:rPr>
+        <w:t xml:space="preserve"> </w:t>
+      </w:r>
+      <w:r>
+        <w:rPr>
+          <w:rStyle w:val="FloatTok"/>
+        </w:rPr>
+        <w:t xml:space="preserve">0.05</w:t>
+      </w:r>
+      <w:r>
+        <w:br/>
+      </w:r>
+      <w:r>
+        <w:br/>
+      </w:r>
+      <w:r>
+        <w:rPr>
+          <w:rStyle w:val="CommentTok"/>
+        </w:rPr>
+        <w:t xml:space="preserve"># Calculate power for detecting a 30 mm difference</w:t>
+      </w:r>
+      <w:r>
+        <w:br/>
+      </w:r>
+      <w:r>
+        <w:br/>
+      </w:r>
+      <w:r>
+        <w:rPr>
+          <w:rStyle w:val="NormalTok"/>
+        </w:rPr>
+        <w:t xml:space="preserve">pine_n1 </w:t>
+      </w:r>
+      <w:r>
+        <w:rPr>
+          <w:rStyle w:val="OtherTok"/>
+        </w:rPr>
+        <w:t xml:space="preserve">&lt;-</w:t>
+      </w:r>
+      <w:r>
+        <w:rPr>
+          <w:rStyle w:val="NormalTok"/>
+        </w:rPr>
+        <w:t xml:space="preserve"> </w:t>
+      </w:r>
+      <w:r>
+        <w:rPr>
+          <w:rStyle w:val="FunctionTok"/>
+        </w:rPr>
+        <w:t xml:space="preserve">nrow</w:t>
+      </w:r>
+      <w:r>
+        <w:rPr>
+          <w:rStyle w:val="NormalTok"/>
+        </w:rPr>
+        <w:t xml:space="preserve">(ps_shady_df)  </w:t>
+      </w:r>
+      <w:r>
+        <w:rPr>
+          <w:rStyle w:val="CommentTok"/>
+        </w:rPr>
+        <w:t xml:space="preserve"># FIX: was using sidney_df instead of ps_shady_df</w:t>
+      </w:r>
+      <w:r>
+        <w:br/>
+      </w:r>
+      <w:r>
+        <w:rPr>
+          <w:rStyle w:val="NormalTok"/>
+        </w:rPr>
+        <w:t xml:space="preserve">pine_n2 </w:t>
+      </w:r>
+      <w:r>
+        <w:rPr>
+          <w:rStyle w:val="OtherTok"/>
+        </w:rPr>
+        <w:t xml:space="preserve">&lt;-</w:t>
+      </w:r>
+      <w:r>
+        <w:rPr>
+          <w:rStyle w:val="NormalTok"/>
+        </w:rPr>
+        <w:t xml:space="preserve"> </w:t>
+      </w:r>
+      <w:r>
+        <w:rPr>
+          <w:rStyle w:val="FunctionTok"/>
+        </w:rPr>
+        <w:t xml:space="preserve">nrow</w:t>
+      </w:r>
+      <w:r>
+        <w:rPr>
+          <w:rStyle w:val="NormalTok"/>
+        </w:rPr>
+        <w:t xml:space="preserve">(ps_sunny_df)  </w:t>
+      </w:r>
+      <w:r>
+        <w:rPr>
+          <w:rStyle w:val="CommentTok"/>
+        </w:rPr>
+        <w:t xml:space="preserve"># FIX: was using vancouver_df instead of ps_sunny_df</w:t>
+      </w:r>
+      <w:r>
+        <w:br/>
+      </w:r>
+      <w:r>
+        <w:br/>
+      </w:r>
+      <w:r>
+        <w:rPr>
+          <w:rStyle w:val="NormalTok"/>
+        </w:rPr>
+        <w:t xml:space="preserve">pine_sd_pooled </w:t>
+      </w:r>
+      <w:r>
+        <w:rPr>
+          <w:rStyle w:val="OtherTok"/>
+        </w:rPr>
+        <w:t xml:space="preserve">&lt;-</w:t>
+      </w:r>
+      <w:r>
+        <w:rPr>
+          <w:rStyle w:val="NormalTok"/>
+        </w:rPr>
+        <w:t xml:space="preserve"> </w:t>
+      </w:r>
+      <w:r>
+        <w:rPr>
+          <w:rStyle w:val="FunctionTok"/>
+        </w:rPr>
+        <w:t xml:space="preserve">sqrt</w:t>
+      </w:r>
+      <w:r>
+        <w:rPr>
+          <w:rStyle w:val="NormalTok"/>
+        </w:rPr>
+        <w:t xml:space="preserve">((</w:t>
+      </w:r>
+      <w:r>
+        <w:rPr>
+          <w:rStyle w:val="FunctionTok"/>
+        </w:rPr>
+        <w:t xml:space="preserve">var</w:t>
+      </w:r>
+      <w:r>
+        <w:rPr>
+          <w:rStyle w:val="NormalTok"/>
+        </w:rPr>
+        <w:t xml:space="preserve">(ps_shady_df</w:t>
+      </w:r>
+      <w:r>
+        <w:rPr>
+          <w:rStyle w:val="SpecialCharTok"/>
+        </w:rPr>
+        <w:t xml:space="preserve">$</w:t>
+      </w:r>
+      <w:r>
+        <w:rPr>
+          <w:rStyle w:val="NormalTok"/>
+        </w:rPr>
+        <w:t xml:space="preserve">length_mm) </w:t>
+      </w:r>
+      <w:r>
+        <w:rPr>
+          <w:rStyle w:val="SpecialCharTok"/>
+        </w:rPr>
+        <w:t xml:space="preserve">*</w:t>
+      </w:r>
+      <w:r>
+        <w:rPr>
+          <w:rStyle w:val="NormalTok"/>
+        </w:rPr>
+        <w:t xml:space="preserve"> (pine_n1</w:t>
+      </w:r>
+      <w:r>
+        <w:rPr>
+          <w:rStyle w:val="DecValTok"/>
+        </w:rPr>
+        <w:t xml:space="preserve">-1</w:t>
+      </w:r>
+      <w:r>
+        <w:rPr>
+          <w:rStyle w:val="NormalTok"/>
+        </w:rPr>
+        <w:t xml:space="preserve">) </w:t>
+      </w:r>
+      <w:r>
+        <w:rPr>
+          <w:rStyle w:val="SpecialCharTok"/>
+        </w:rPr>
+        <w:t xml:space="preserve">+</w:t>
+      </w:r>
+      <w:r>
+        <w:rPr>
+          <w:rStyle w:val="NormalTok"/>
+        </w:rPr>
+        <w:t xml:space="preserve"> </w:t>
+      </w:r>
+      <w:r>
+        <w:br/>
+      </w:r>
+      <w:r>
+        <w:rPr>
+          <w:rStyle w:val="NormalTok"/>
+        </w:rPr>
+        <w:t xml:space="preserve">                       </w:t>
+      </w:r>
+      <w:r>
+        <w:rPr>
+          <w:rStyle w:val="FunctionTok"/>
+        </w:rPr>
+        <w:t xml:space="preserve">var</w:t>
+      </w:r>
+      <w:r>
+        <w:rPr>
+          <w:rStyle w:val="NormalTok"/>
+        </w:rPr>
+        <w:t xml:space="preserve">(ps_sunny_df</w:t>
+      </w:r>
+      <w:r>
+        <w:rPr>
+          <w:rStyle w:val="SpecialCharTok"/>
+        </w:rPr>
+        <w:t xml:space="preserve">$</w:t>
+      </w:r>
+      <w:r>
+        <w:rPr>
+          <w:rStyle w:val="NormalTok"/>
+        </w:rPr>
+        <w:t xml:space="preserve">length_mm) </w:t>
+      </w:r>
+      <w:r>
+        <w:rPr>
+          <w:rStyle w:val="SpecialCharTok"/>
+        </w:rPr>
+        <w:t xml:space="preserve">*</w:t>
+      </w:r>
+      <w:r>
+        <w:rPr>
+          <w:rStyle w:val="NormalTok"/>
+        </w:rPr>
+        <w:t xml:space="preserve"> (pine_n2</w:t>
+      </w:r>
+      <w:r>
+        <w:rPr>
+          <w:rStyle w:val="DecValTok"/>
+        </w:rPr>
+        <w:t xml:space="preserve">-1</w:t>
+      </w:r>
+      <w:r>
+        <w:rPr>
+          <w:rStyle w:val="NormalTok"/>
+        </w:rPr>
+        <w:t xml:space="preserve">)) </w:t>
+      </w:r>
+      <w:r>
+        <w:rPr>
+          <w:rStyle w:val="SpecialCharTok"/>
+        </w:rPr>
+        <w:t xml:space="preserve">/</w:t>
+      </w:r>
+      <w:r>
+        <w:rPr>
+          <w:rStyle w:val="NormalTok"/>
+        </w:rPr>
+        <w:t xml:space="preserve"> </w:t>
+      </w:r>
+      <w:r>
+        <w:br/>
+      </w:r>
+      <w:r>
+        <w:rPr>
+          <w:rStyle w:val="NormalTok"/>
+        </w:rPr>
+        <w:t xml:space="preserve">                       (pine_n1 </w:t>
+      </w:r>
+      <w:r>
+        <w:rPr>
+          <w:rStyle w:val="SpecialCharTok"/>
+        </w:rPr>
+        <w:t xml:space="preserve">+</w:t>
+      </w:r>
+      <w:r>
+        <w:rPr>
+          <w:rStyle w:val="NormalTok"/>
+        </w:rPr>
+        <w:t xml:space="preserve"> pine_n2 </w:t>
+      </w:r>
+      <w:r>
+        <w:rPr>
+          <w:rStyle w:val="SpecialCharTok"/>
+        </w:rPr>
+        <w:t xml:space="preserve">-</w:t>
+      </w:r>
+      <w:r>
+        <w:rPr>
+          <w:rStyle w:val="NormalTok"/>
+        </w:rPr>
+        <w:t xml:space="preserve"> </w:t>
+      </w:r>
+      <w:r>
+        <w:rPr>
+          <w:rStyle w:val="DecValTok"/>
+        </w:rPr>
+        <w:t xml:space="preserve">2</w:t>
+      </w:r>
+      <w:r>
+        <w:rPr>
+          <w:rStyle w:val="NormalTok"/>
+        </w:rPr>
+        <w:t xml:space="preserve">))  </w:t>
+      </w:r>
+      <w:r>
+        <w:rPr>
+          <w:rStyle w:val="CommentTok"/>
+        </w:rPr>
+        <w:t xml:space="preserve"># FIX: was using n1, n2 instead of pine_n1, pine_n2</w:t>
+      </w:r>
+      <w:r>
+        <w:br/>
+      </w:r>
+      <w:r>
+        <w:br/>
+      </w:r>
+      <w:r>
+        <w:rPr>
+          <w:rStyle w:val="FunctionTok"/>
+        </w:rPr>
+        <w:t xml:space="preserve">cat</w:t>
+      </w:r>
+      <w:r>
+        <w:rPr>
+          <w:rStyle w:val="NormalTok"/>
+        </w:rPr>
+        <w:t xml:space="preserve">(</w:t>
+      </w:r>
+      <w:r>
+        <w:rPr>
+          <w:rStyle w:val="StringTok"/>
+        </w:rPr>
+        <w:t xml:space="preserve">"Pooled SD:"</w:t>
+      </w:r>
+      <w:r>
+        <w:rPr>
+          <w:rStyle w:val="NormalTok"/>
+        </w:rPr>
+        <w:t xml:space="preserve">, </w:t>
+      </w:r>
+      <w:r>
+        <w:rPr>
+          <w:rStyle w:val="FunctionTok"/>
+        </w:rPr>
+        <w:t xml:space="preserve">round</w:t>
+      </w:r>
+      <w:r>
+        <w:rPr>
+          <w:rStyle w:val="NormalTok"/>
+        </w:rPr>
+        <w:t xml:space="preserve">(pine_sd_pooled, </w:t>
+      </w:r>
+      <w:r>
+        <w:rPr>
+          <w:rStyle w:val="DecValTok"/>
+        </w:rPr>
+        <w:t xml:space="preserve">2</w:t>
+      </w:r>
+      <w:r>
+        <w:rPr>
+          <w:rStyle w:val="NormalTok"/>
+        </w:rPr>
+        <w:t xml:space="preserve">), </w:t>
+      </w:r>
+      <w:r>
+        <w:rPr>
+          <w:rStyle w:val="StringTok"/>
+        </w:rPr>
+        <w:t xml:space="preserve">"mm</w:t>
+      </w:r>
+      <w:r>
+        <w:rPr>
+          <w:rStyle w:val="SpecialCharTok"/>
+        </w:rPr>
+        <w:t xml:space="preserve">\n\n</w:t>
+      </w:r>
+      <w:r>
+        <w:rPr>
+          <w:rStyle w:val="StringTok"/>
+        </w:rPr>
+        <w:t xml:space="preserve">"</w:t>
+      </w:r>
+      <w:r>
+        <w:rPr>
+          <w:rStyle w:val="NormalTok"/>
+        </w:rPr>
+        <w:t xml:space="preserve">)</w:t>
+      </w:r>
+    </w:p>
+    <w:p>
+      <w:pPr>
+        <w:pStyle w:val="SourceCode"/>
+      </w:pPr>
+      <w:r>
+        <w:rPr>
+          <w:rStyle w:val="VerbatimChar"/>
+        </w:rPr>
+        <w:t xml:space="preserve">Pooled SD: 2.58 mm</w:t>
+      </w:r>
+    </w:p>
+    <w:p>
+      <w:pPr>
+        <w:pStyle w:val="SourceCode"/>
+      </w:pPr>
+      <w:r>
+        <w:rPr>
+          <w:rStyle w:val="CommentTok"/>
+        </w:rPr>
+        <w:t xml:space="preserve"># More realistic effect sizes to test:</w:t>
+      </w:r>
+      <w:r>
+        <w:br/>
+      </w:r>
+      <w:r>
+        <w:rPr>
+          <w:rStyle w:val="NormalTok"/>
+        </w:rPr>
+        <w:t xml:space="preserve">observed_diff </w:t>
+      </w:r>
+      <w:r>
+        <w:rPr>
+          <w:rStyle w:val="OtherTok"/>
+        </w:rPr>
+        <w:t xml:space="preserve">&lt;-</w:t>
+      </w:r>
+      <w:r>
+        <w:rPr>
+          <w:rStyle w:val="NormalTok"/>
+        </w:rPr>
+        <w:t xml:space="preserve"> </w:t>
+      </w:r>
+      <w:r>
+        <w:rPr>
+          <w:rStyle w:val="FunctionTok"/>
+        </w:rPr>
+        <w:t xml:space="preserve">abs</w:t>
+      </w:r>
+      <w:r>
+        <w:rPr>
+          <w:rStyle w:val="NormalTok"/>
+        </w:rPr>
+        <w:t xml:space="preserve">(</w:t>
+      </w:r>
+      <w:r>
+        <w:rPr>
+          <w:rStyle w:val="FunctionTok"/>
+        </w:rPr>
+        <w:t xml:space="preserve">mean</w:t>
+      </w:r>
+      <w:r>
+        <w:rPr>
+          <w:rStyle w:val="NormalTok"/>
+        </w:rPr>
+        <w:t xml:space="preserve">(ps_shady_df</w:t>
+      </w:r>
+      <w:r>
+        <w:rPr>
+          <w:rStyle w:val="SpecialCharTok"/>
+        </w:rPr>
+        <w:t xml:space="preserve">$</w:t>
+      </w:r>
+      <w:r>
+        <w:rPr>
+          <w:rStyle w:val="NormalTok"/>
+        </w:rPr>
+        <w:t xml:space="preserve">length_mm) </w:t>
+      </w:r>
+      <w:r>
+        <w:rPr>
+          <w:rStyle w:val="SpecialCharTok"/>
+        </w:rPr>
+        <w:t xml:space="preserve">-</w:t>
+      </w:r>
+      <w:r>
+        <w:rPr>
+          <w:rStyle w:val="NormalTok"/>
+        </w:rPr>
+        <w:t xml:space="preserve"> </w:t>
+      </w:r>
+      <w:r>
+        <w:rPr>
+          <w:rStyle w:val="FunctionTok"/>
+        </w:rPr>
+        <w:t xml:space="preserve">mean</w:t>
+      </w:r>
+      <w:r>
+        <w:rPr>
+          <w:rStyle w:val="NormalTok"/>
+        </w:rPr>
+        <w:t xml:space="preserve">(ps_sunny_df</w:t>
+      </w:r>
+      <w:r>
+        <w:rPr>
+          <w:rStyle w:val="SpecialCharTok"/>
+        </w:rPr>
+        <w:t xml:space="preserve">$</w:t>
+      </w:r>
+      <w:r>
+        <w:rPr>
+          <w:rStyle w:val="NormalTok"/>
+        </w:rPr>
+        <w:t xml:space="preserve">length_mm))</w:t>
+      </w:r>
+      <w:r>
+        <w:br/>
+      </w:r>
+      <w:r>
+        <w:rPr>
+          <w:rStyle w:val="NormalTok"/>
+        </w:rPr>
+        <w:t xml:space="preserve">pine_effect_size_observed </w:t>
+      </w:r>
+      <w:r>
+        <w:rPr>
+          <w:rStyle w:val="OtherTok"/>
+        </w:rPr>
+        <w:t xml:space="preserve">&lt;-</w:t>
+      </w:r>
+      <w:r>
+        <w:rPr>
+          <w:rStyle w:val="NormalTok"/>
+        </w:rPr>
+        <w:t xml:space="preserve"> observed_diff </w:t>
+      </w:r>
+      <w:r>
+        <w:rPr>
+          <w:rStyle w:val="SpecialCharTok"/>
+        </w:rPr>
+        <w:t xml:space="preserve">/</w:t>
+      </w:r>
+      <w:r>
+        <w:rPr>
+          <w:rStyle w:val="NormalTok"/>
+        </w:rPr>
+        <w:t xml:space="preserve"> pine_sd_pooled</w:t>
+      </w:r>
+      <w:r>
+        <w:br/>
+      </w:r>
+      <w:r>
+        <w:rPr>
+          <w:rStyle w:val="FunctionTok"/>
+        </w:rPr>
+        <w:t xml:space="preserve">cat</w:t>
+      </w:r>
+      <w:r>
+        <w:rPr>
+          <w:rStyle w:val="NormalTok"/>
+        </w:rPr>
+        <w:t xml:space="preserve">(</w:t>
+      </w:r>
+      <w:r>
+        <w:rPr>
+          <w:rStyle w:val="StringTok"/>
+        </w:rPr>
+        <w:t xml:space="preserve">"Effect size for observed"</w:t>
+      </w:r>
+      <w:r>
+        <w:rPr>
+          <w:rStyle w:val="NormalTok"/>
+        </w:rPr>
+        <w:t xml:space="preserve">, </w:t>
+      </w:r>
+      <w:r>
+        <w:rPr>
+          <w:rStyle w:val="FunctionTok"/>
+        </w:rPr>
+        <w:t xml:space="preserve">round</w:t>
+      </w:r>
+      <w:r>
+        <w:rPr>
+          <w:rStyle w:val="NormalTok"/>
+        </w:rPr>
+        <w:t xml:space="preserve">(observed_diff, </w:t>
+      </w:r>
+      <w:r>
+        <w:rPr>
+          <w:rStyle w:val="DecValTok"/>
+        </w:rPr>
+        <w:t xml:space="preserve">2</w:t>
+      </w:r>
+      <w:r>
+        <w:rPr>
+          <w:rStyle w:val="NormalTok"/>
+        </w:rPr>
+        <w:t xml:space="preserve">), </w:t>
+      </w:r>
+      <w:r>
+        <w:rPr>
+          <w:rStyle w:val="StringTok"/>
+        </w:rPr>
+        <w:t xml:space="preserve">"mm difference: Cohen's d ="</w:t>
+      </w:r>
+      <w:r>
+        <w:rPr>
+          <w:rStyle w:val="NormalTok"/>
+        </w:rPr>
+        <w:t xml:space="preserve">, </w:t>
+      </w:r>
+      <w:r>
+        <w:rPr>
+          <w:rStyle w:val="FunctionTok"/>
+        </w:rPr>
+        <w:t xml:space="preserve">round</w:t>
+      </w:r>
+      <w:r>
+        <w:rPr>
+          <w:rStyle w:val="NormalTok"/>
+        </w:rPr>
+        <w:t xml:space="preserve">(pine_effect_size_observed, </w:t>
+      </w:r>
+      <w:r>
+        <w:rPr>
+          <w:rStyle w:val="DecValTok"/>
+        </w:rPr>
+        <w:t xml:space="preserve">2</w:t>
+      </w:r>
+      <w:r>
+        <w:rPr>
+          <w:rStyle w:val="NormalTok"/>
+        </w:rPr>
+        <w:t xml:space="preserve">), </w:t>
+      </w:r>
+      <w:r>
+        <w:rPr>
+          <w:rStyle w:val="StringTok"/>
+        </w:rPr>
+        <w:t xml:space="preserve">"</w:t>
+      </w:r>
+      <w:r>
+        <w:rPr>
+          <w:rStyle w:val="SpecialCharTok"/>
+        </w:rPr>
+        <w:t xml:space="preserve">\n</w:t>
+      </w:r>
+      <w:r>
+        <w:rPr>
+          <w:rStyle w:val="StringTok"/>
+        </w:rPr>
+        <w:t xml:space="preserve">"</w:t>
+      </w:r>
+      <w:r>
+        <w:rPr>
+          <w:rStyle w:val="NormalTok"/>
+        </w:rPr>
+        <w:t xml:space="preserve">)</w:t>
+      </w:r>
+    </w:p>
+    <w:p>
+      <w:pPr>
+        <w:pStyle w:val="SourceCode"/>
+      </w:pPr>
+      <w:r>
+        <w:rPr>
+          <w:rStyle w:val="VerbatimChar"/>
+        </w:rPr>
+        <w:t xml:space="preserve">Effect size for observed 1.45 mm difference: Cohen's d = 0.56 </w:t>
+      </w:r>
+    </w:p>
+    <w:p>
+      <w:pPr>
+        <w:pStyle w:val="SourceCode"/>
+      </w:pPr>
+      <w:r>
+        <w:rPr>
+          <w:rStyle w:val="CommentTok"/>
+        </w:rPr>
+        <w:t xml:space="preserve"># 2. Power for the observed difference</w:t>
+      </w:r>
+      <w:r>
+        <w:br/>
+      </w:r>
+      <w:r>
+        <w:rPr>
+          <w:rStyle w:val="NormalTok"/>
+        </w:rPr>
+        <w:t xml:space="preserve">pine_power_observed </w:t>
+      </w:r>
+      <w:r>
+        <w:rPr>
+          <w:rStyle w:val="OtherTok"/>
+        </w:rPr>
+        <w:t xml:space="preserve">&lt;-</w:t>
+      </w:r>
+      <w:r>
+        <w:rPr>
+          <w:rStyle w:val="NormalTok"/>
+        </w:rPr>
+        <w:t xml:space="preserve"> </w:t>
+      </w:r>
+      <w:r>
+        <w:rPr>
+          <w:rStyle w:val="FunctionTok"/>
+        </w:rPr>
+        <w:t xml:space="preserve">power.t.test</w:t>
+      </w:r>
+      <w:r>
+        <w:rPr>
+          <w:rStyle w:val="NormalTok"/>
+        </w:rPr>
+        <w:t xml:space="preserve">(</w:t>
+      </w:r>
+      <w:r>
+        <w:rPr>
+          <w:rStyle w:val="AttributeTok"/>
+        </w:rPr>
+        <w:t xml:space="preserve">n =</w:t>
+      </w:r>
+      <w:r>
+        <w:rPr>
+          <w:rStyle w:val="NormalTok"/>
+        </w:rPr>
+        <w:t xml:space="preserve"> </w:t>
+      </w:r>
+      <w:r>
+        <w:rPr>
+          <w:rStyle w:val="FunctionTok"/>
+        </w:rPr>
+        <w:t xml:space="preserve">min</w:t>
+      </w:r>
+      <w:r>
+        <w:rPr>
+          <w:rStyle w:val="NormalTok"/>
+        </w:rPr>
+        <w:t xml:space="preserve">(pine_n1, pine_n2), </w:t>
+      </w:r>
+      <w:r>
+        <w:br/>
+      </w:r>
+      <w:r>
+        <w:rPr>
+          <w:rStyle w:val="NormalTok"/>
+        </w:rPr>
+        <w:t xml:space="preserve">                                   </w:t>
+      </w:r>
+      <w:r>
+        <w:rPr>
+          <w:rStyle w:val="AttributeTok"/>
+        </w:rPr>
+        <w:t xml:space="preserve">delta =</w:t>
+      </w:r>
+      <w:r>
+        <w:rPr>
+          <w:rStyle w:val="NormalTok"/>
+        </w:rPr>
+        <w:t xml:space="preserve"> pine_effect_size_observed,</w:t>
+      </w:r>
+      <w:r>
+        <w:br/>
+      </w:r>
+      <w:r>
+        <w:rPr>
+          <w:rStyle w:val="NormalTok"/>
+        </w:rPr>
+        <w:t xml:space="preserve">                                   </w:t>
+      </w:r>
+      <w:r>
+        <w:rPr>
+          <w:rStyle w:val="AttributeTok"/>
+        </w:rPr>
+        <w:t xml:space="preserve">sd =</w:t>
+      </w:r>
+      <w:r>
+        <w:rPr>
+          <w:rStyle w:val="NormalTok"/>
+        </w:rPr>
+        <w:t xml:space="preserve"> </w:t>
+      </w:r>
+      <w:r>
+        <w:rPr>
+          <w:rStyle w:val="DecValTok"/>
+        </w:rPr>
+        <w:t xml:space="preserve">1</w:t>
+      </w:r>
+      <w:r>
+        <w:rPr>
+          <w:rStyle w:val="NormalTok"/>
+        </w:rPr>
+        <w:t xml:space="preserve">,</w:t>
+      </w:r>
+      <w:r>
+        <w:br/>
+      </w:r>
+      <w:r>
+        <w:rPr>
+          <w:rStyle w:val="NormalTok"/>
+        </w:rPr>
+        <w:t xml:space="preserve">                                   </w:t>
+      </w:r>
+      <w:r>
+        <w:rPr>
+          <w:rStyle w:val="AttributeTok"/>
+        </w:rPr>
+        <w:t xml:space="preserve">sig.level =</w:t>
+      </w:r>
+      <w:r>
+        <w:rPr>
+          <w:rStyle w:val="NormalTok"/>
+        </w:rPr>
+        <w:t xml:space="preserve"> pine_alpha,</w:t>
+      </w:r>
+      <w:r>
+        <w:br/>
+      </w:r>
+      <w:r>
+        <w:rPr>
+          <w:rStyle w:val="NormalTok"/>
+        </w:rPr>
+        <w:t xml:space="preserve">                                   </w:t>
+      </w:r>
+      <w:r>
+        <w:rPr>
+          <w:rStyle w:val="AttributeTok"/>
+        </w:rPr>
+        <w:t xml:space="preserve">type =</w:t>
+      </w:r>
+      <w:r>
+        <w:rPr>
+          <w:rStyle w:val="NormalTok"/>
+        </w:rPr>
+        <w:t xml:space="preserve"> </w:t>
+      </w:r>
+      <w:r>
+        <w:rPr>
+          <w:rStyle w:val="StringTok"/>
+        </w:rPr>
+        <w:t xml:space="preserve">"two.sample"</w:t>
+      </w:r>
+      <w:r>
+        <w:rPr>
+          <w:rStyle w:val="NormalTok"/>
+        </w:rPr>
+        <w:t xml:space="preserve">,</w:t>
+      </w:r>
+      <w:r>
+        <w:br/>
+      </w:r>
+      <w:r>
+        <w:rPr>
+          <w:rStyle w:val="NormalTok"/>
+        </w:rPr>
+        <w:t xml:space="preserve">                                   </w:t>
+      </w:r>
+      <w:r>
+        <w:rPr>
+          <w:rStyle w:val="AttributeTok"/>
+        </w:rPr>
+        <w:t xml:space="preserve">alternative =</w:t>
+      </w:r>
+      <w:r>
+        <w:rPr>
+          <w:rStyle w:val="NormalTok"/>
+        </w:rPr>
+        <w:t xml:space="preserve"> </w:t>
+      </w:r>
+      <w:r>
+        <w:rPr>
+          <w:rStyle w:val="StringTok"/>
+        </w:rPr>
+        <w:t xml:space="preserve">"two.sided"</w:t>
+      </w:r>
+      <w:r>
+        <w:rPr>
+          <w:rStyle w:val="NormalTok"/>
+        </w:rPr>
+        <w:t xml:space="preserve">)</w:t>
+      </w:r>
+      <w:r>
+        <w:br/>
+      </w:r>
+      <w:r>
+        <w:br/>
+      </w:r>
+      <w:r>
+        <w:rPr>
+          <w:rStyle w:val="FunctionTok"/>
+        </w:rPr>
+        <w:t xml:space="preserve">cat</w:t>
+      </w:r>
+      <w:r>
+        <w:rPr>
+          <w:rStyle w:val="NormalTok"/>
+        </w:rPr>
+        <w:t xml:space="preserve">(</w:t>
+      </w:r>
+      <w:r>
+        <w:rPr>
+          <w:rStyle w:val="StringTok"/>
+        </w:rPr>
+        <w:t xml:space="preserve">"Power for observed"</w:t>
+      </w:r>
+      <w:r>
+        <w:rPr>
+          <w:rStyle w:val="NormalTok"/>
+        </w:rPr>
+        <w:t xml:space="preserve">, </w:t>
+      </w:r>
+      <w:r>
+        <w:rPr>
+          <w:rStyle w:val="FunctionTok"/>
+        </w:rPr>
+        <w:t xml:space="preserve">round</w:t>
+      </w:r>
+      <w:r>
+        <w:rPr>
+          <w:rStyle w:val="NormalTok"/>
+        </w:rPr>
+        <w:t xml:space="preserve">(observed_diff, </w:t>
+      </w:r>
+      <w:r>
+        <w:rPr>
+          <w:rStyle w:val="DecValTok"/>
+        </w:rPr>
+        <w:t xml:space="preserve">2</w:t>
+      </w:r>
+      <w:r>
+        <w:rPr>
+          <w:rStyle w:val="NormalTok"/>
+        </w:rPr>
+        <w:t xml:space="preserve">), </w:t>
+      </w:r>
+      <w:r>
+        <w:rPr>
+          <w:rStyle w:val="StringTok"/>
+        </w:rPr>
+        <w:t xml:space="preserve">"mm difference:"</w:t>
+      </w:r>
+      <w:r>
+        <w:rPr>
+          <w:rStyle w:val="NormalTok"/>
+        </w:rPr>
+        <w:t xml:space="preserve">, </w:t>
+      </w:r>
+      <w:r>
+        <w:rPr>
+          <w:rStyle w:val="FunctionTok"/>
+        </w:rPr>
+        <w:t xml:space="preserve">round</w:t>
+      </w:r>
+      <w:r>
+        <w:rPr>
+          <w:rStyle w:val="NormalTok"/>
+        </w:rPr>
+        <w:t xml:space="preserve">(pine_power_observed</w:t>
+      </w:r>
+      <w:r>
+        <w:rPr>
+          <w:rStyle w:val="SpecialCharTok"/>
+        </w:rPr>
+        <w:t xml:space="preserve">$</w:t>
+      </w:r>
+      <w:r>
+        <w:rPr>
+          <w:rStyle w:val="NormalTok"/>
+        </w:rPr>
+        <w:t xml:space="preserve">power, </w:t>
+      </w:r>
+      <w:r>
+        <w:rPr>
+          <w:rStyle w:val="DecValTok"/>
+        </w:rPr>
+        <w:t xml:space="preserve">3</w:t>
+      </w:r>
+      <w:r>
+        <w:rPr>
+          <w:rStyle w:val="NormalTok"/>
+        </w:rPr>
+        <w:t xml:space="preserve">), </w:t>
+      </w:r>
+      <w:r>
+        <w:rPr>
+          <w:rStyle w:val="StringTok"/>
+        </w:rPr>
+        <w:t xml:space="preserve">"</w:t>
+      </w:r>
+      <w:r>
+        <w:rPr>
+          <w:rStyle w:val="SpecialCharTok"/>
+        </w:rPr>
+        <w:t xml:space="preserve">\n</w:t>
+      </w:r>
+      <w:r>
+        <w:rPr>
+          <w:rStyle w:val="StringTok"/>
+        </w:rPr>
+        <w:t xml:space="preserve">"</w:t>
+      </w:r>
+      <w:r>
+        <w:rPr>
+          <w:rStyle w:val="NormalTok"/>
+        </w:rPr>
+        <w:t xml:space="preserve">)</w:t>
+      </w:r>
+    </w:p>
+    <w:p>
+      <w:pPr>
+        <w:pStyle w:val="SourceCode"/>
+      </w:pPr>
+      <w:r>
+        <w:rPr>
+          <w:rStyle w:val="VerbatimChar"/>
+        </w:rPr>
+        <w:t xml:space="preserve">Power for observed 1.45 mm difference: 0.182 </w:t>
+      </w:r>
+    </w:p>
+    <w:bookmarkEnd w:id="80"/>
+    <w:bookmarkStart w:id="81" w:name="what-is-power"/>
+    <w:p>
+      <w:pPr>
+        <w:pStyle w:val="Heading1"/>
+      </w:pPr>
+      <w:r>
         <w:t xml:space="preserve">What is Power</w:t>
       </w:r>
     </w:p>
@@ -3691,7 +5470,31 @@
         <w:pStyle w:val="FirstParagraph"/>
       </w:pPr>
       <w:r>
-        <w:t xml:space="preserve">Statistical power represents the probability of detecting a true effect (rejecting the null hypothesis when it is false). In this case, with a power of 97%, there’s a 97% chance of detecting a true difference of 30 units between the means of the two groups if such a difference actually exists.</w:t>
+        <w:t xml:space="preserve">Statistical power represents the probability of detecting a true effect</w:t>
+      </w:r>
+      <w:r>
+        <w:t xml:space="preserve"> </w:t>
+      </w:r>
+      <w:r>
+        <w:t xml:space="preserve">(rejecting the null hypothesis when it is false). In this case, with a</w:t>
+      </w:r>
+      <w:r>
+        <w:t xml:space="preserve"> </w:t>
+      </w:r>
+      <w:r>
+        <w:t xml:space="preserve">power of 97%, there’s a 97% chance of detecting a true difference of X</w:t>
+      </w:r>
+      <w:r>
+        <w:t xml:space="preserve"> </w:t>
+      </w:r>
+      <w:r>
+        <w:t xml:space="preserve">units between the means of the two groups if such a difference actually</w:t>
+      </w:r>
+      <w:r>
+        <w:t xml:space="preserve"> </w:t>
+      </w:r>
+      <w:r>
+        <w:t xml:space="preserve">exists.</w:t>
       </w:r>
     </w:p>
     <w:p>
@@ -3735,7 +5538,13 @@
         </w:numPr>
       </w:pPr>
       <w:r>
-        <w:t xml:space="preserve">To determine the minimum detectable effect size with the given sample</w:t>
+        <w:t xml:space="preserve">To determine the minimum detectable effect size with the given</w:t>
+      </w:r>
+      <w:r>
+        <w:t xml:space="preserve"> </w:t>
+      </w:r>
+      <w:r>
+        <w:t xml:space="preserve">sample</w:t>
       </w:r>
     </w:p>
     <w:p>
@@ -3743,7 +5552,13 @@
         <w:pStyle w:val="FirstParagraph"/>
       </w:pPr>
       <w:r>
-        <w:t xml:space="preserve">With 97% power, this test has excellent ability to detect the specified effect size. Generally,</w:t>
+        <w:t xml:space="preserve">With 97% power, this test has excellent ability to detect the specified</w:t>
+      </w:r>
+      <w:r>
+        <w:t xml:space="preserve"> </w:t>
+      </w:r>
+      <w:r>
+        <w:t xml:space="preserve">effect size. Generally,</w:t>
       </w:r>
       <w:r>
         <w:t xml:space="preserve"> </w:t>
@@ -3756,11 +5571,23 @@
         <w:t xml:space="preserve">80% power is considered acceptable</w:t>
       </w:r>
       <w:r>
-        <w:t xml:space="preserve">, so 97% indicates a very well-powered study for detecting a difference of 30mm between the groups.</w:t>
-      </w:r>
-    </w:p>
-    <w:bookmarkEnd w:id="80"/>
-    <w:bookmarkStart w:id="84" w:name="Xb29f383daa8c3c81bb8914ce0215d82ab078651"/>
+        <w:t xml:space="preserve">, so 97%</w:t>
+      </w:r>
+      <w:r>
+        <w:t xml:space="preserve"> </w:t>
+      </w:r>
+      <w:r>
+        <w:t xml:space="preserve">indicates a very well-powered study for detecting a difference of XXg</w:t>
+      </w:r>
+      <w:r>
+        <w:t xml:space="preserve"> </w:t>
+      </w:r>
+      <w:r>
+        <w:t xml:space="preserve">between the groups.</w:t>
+      </w:r>
+    </w:p>
+    <w:bookmarkEnd w:id="81"/>
+    <w:bookmarkStart w:id="85" w:name="Xb29f383daa8c3c81bb8914ce0215d82ab078651"/>
     <w:p>
       <w:pPr>
         <w:pStyle w:val="Heading1"/>
@@ -3784,7 +5611,13 @@
         <w:pStyle w:val="FirstParagraph"/>
       </w:pPr>
       <w:r>
-        <w:t xml:space="preserve">Error bars are graphical representations of the variability of data that show:</w:t>
+        <w:t xml:space="preserve">Error bars are graphical representations of the variability of data that</w:t>
+      </w:r>
+      <w:r>
+        <w:t xml:space="preserve"> </w:t>
+      </w:r>
+      <w:r>
+        <w:t xml:space="preserve">show:</w:t>
       </w:r>
     </w:p>
     <w:p>
@@ -3965,7 +5798,13 @@
         </w:numPr>
       </w:pPr>
       <w:r>
-        <w:t xml:space="preserve">Non-overlapping 95% CI bars suggest statistically significant differences</w:t>
+        <w:t xml:space="preserve">Non-overlapping 95% CI bars suggest statistically significant</w:t>
+      </w:r>
+      <w:r>
+        <w:t xml:space="preserve"> </w:t>
+      </w:r>
+      <w:r>
+        <w:t xml:space="preserve">differences</w:t>
       </w:r>
     </w:p>
     <w:p>
@@ -3987,20 +5826,20 @@
       <w:r>
         <w:drawing>
           <wp:inline>
-            <wp:extent cx="6578600" cy="6578600"/>
+            <wp:extent cx="4572000" cy="4572000"/>
             <wp:effectExtent b="0" l="0" r="0" t="0"/>
-            <wp:docPr descr="" title="" id="82" name="Picture"/>
+            <wp:docPr descr="" title="" id="83" name="Picture"/>
             <a:graphic>
               <a:graphicData uri="http://schemas.openxmlformats.org/drawingml/2006/picture">
                 <pic:pic>
                   <pic:nvPicPr>
-                    <pic:cNvPr descr="06_01_lecture_powerpoint_files/figure-docx/unnamed-chunk-4-1.png" id="83" name="Picture"/>
+                    <pic:cNvPr descr="06_01_lecture_powerpoint_files/figure-docx/unnamed-chunk-5-1.png" id="84" name="Picture"/>
                     <pic:cNvPicPr>
                       <a:picLocks noChangeArrowheads="1" noChangeAspect="1"/>
                     </pic:cNvPicPr>
                   </pic:nvPicPr>
                   <pic:blipFill>
-                    <a:blip r:embed="rId81"/>
+                    <a:blip r:embed="rId82"/>
                     <a:stretch>
                       <a:fillRect/>
                     </a:stretch>
@@ -4008,7 +5847,7 @@
                   <pic:spPr bwMode="auto">
                     <a:xfrm>
                       <a:off x="0" y="0"/>
-                      <a:ext cx="6578600" cy="6578600"/>
+                      <a:ext cx="4572000" cy="4572000"/>
                     </a:xfrm>
                     <a:prstGeom prst="rect">
                       <a:avLst/>
@@ -4027,8 +5866,8 @@
         </w:drawing>
       </w:r>
     </w:p>
-    <w:bookmarkEnd w:id="84"/>
-    <w:bookmarkStart w:id="88" w:name="lecture-6-sampling-and-pseudoreplication"/>
+    <w:bookmarkEnd w:id="85"/>
+    <w:bookmarkStart w:id="89" w:name="lecture-6-sampling-and-pseudoreplication"/>
     <w:p>
       <w:pPr>
         <w:pStyle w:val="Heading1"/>
@@ -4062,7 +5901,13 @@
         <w:t xml:space="preserve"> </w:t>
       </w:r>
       <w:r>
-        <w:t xml:space="preserve">occurs when measurements that are not independent are analyzed as if they were independent.</w:t>
+        <w:t xml:space="preserve">occurs when measurements that are not independent</w:t>
+      </w:r>
+      <w:r>
+        <w:t xml:space="preserve"> </w:t>
+      </w:r>
+      <w:r>
+        <w:t xml:space="preserve">are analyzed as if they were independent.</w:t>
       </w:r>
     </w:p>
     <w:p>
@@ -4204,20 +6049,20 @@
       <w:r>
         <w:drawing>
           <wp:inline>
-            <wp:extent cx="6578600" cy="6578600"/>
+            <wp:extent cx="4572000" cy="4572000"/>
             <wp:effectExtent b="0" l="0" r="0" t="0"/>
-            <wp:docPr descr="" title="" id="86" name="Picture"/>
+            <wp:docPr descr="" title="" id="87" name="Picture"/>
             <a:graphic>
               <a:graphicData uri="http://schemas.openxmlformats.org/drawingml/2006/picture">
                 <pic:pic>
                   <pic:nvPicPr>
-                    <pic:cNvPr descr="06_01_lecture_powerpoint_files/figure-docx/unnamed-chunk-5-1.png" id="87" name="Picture"/>
+                    <pic:cNvPr descr="06_01_lecture_powerpoint_files/figure-docx/unnamed-chunk-6-1.png" id="88" name="Picture"/>
                     <pic:cNvPicPr>
                       <a:picLocks noChangeArrowheads="1" noChangeAspect="1"/>
                     </pic:cNvPicPr>
                   </pic:nvPicPr>
                   <pic:blipFill>
-                    <a:blip r:embed="rId85"/>
+                    <a:blip r:embed="rId86"/>
                     <a:stretch>
                       <a:fillRect/>
                     </a:stretch>
@@ -4225,7 +6070,7 @@
                   <pic:spPr bwMode="auto">
                     <a:xfrm>
                       <a:off x="0" y="0"/>
-                      <a:ext cx="6578600" cy="6578600"/>
+                      <a:ext cx="4572000" cy="4572000"/>
                     </a:xfrm>
                     <a:prstGeom prst="rect">
                       <a:avLst/>
@@ -4244,8 +6089,8 @@
         </w:drawing>
       </w:r>
     </w:p>
-    <w:bookmarkEnd w:id="88"/>
-    <w:bookmarkStart w:id="92" w:name="X7c1afc640c5c294466a23b01e3107d4bfb54bfd"/>
+    <w:bookmarkEnd w:id="89"/>
+    <w:bookmarkStart w:id="93" w:name="X7c1afc640c5c294466a23b01e3107d4bfb54bfd"/>
     <w:p>
       <w:pPr>
         <w:pStyle w:val="Heading1"/>
@@ -4269,7 +6114,13 @@
         <w:pStyle w:val="FirstParagraph"/>
       </w:pPr>
       <w:r>
-        <w:t xml:space="preserve">The statistical concepts we’ve covered today are essential for fisheries biologists and ecologists:</w:t>
+        <w:t xml:space="preserve">The statistical concepts we’ve covered today are essential for fisheries</w:t>
+      </w:r>
+      <w:r>
+        <w:t xml:space="preserve"> </w:t>
+      </w:r>
+      <w:r>
+        <w:t xml:space="preserve">biologists and ecologists:</w:t>
       </w:r>
     </w:p>
     <w:p>
@@ -4313,7 +6164,13 @@
         <w:t xml:space="preserve"> </w:t>
       </w:r>
       <w:r>
-        <w:t xml:space="preserve">provide plausible ranges for population parameters</w:t>
+        <w:t xml:space="preserve">provide plausible ranges for population</w:t>
+      </w:r>
+      <w:r>
+        <w:t xml:space="preserve"> </w:t>
+      </w:r>
+      <w:r>
+        <w:t xml:space="preserve">parameters</w:t>
       </w:r>
     </w:p>
     <w:p>
@@ -4439,20 +6296,20 @@
       <w:r>
         <w:drawing>
           <wp:inline>
-            <wp:extent cx="6578600" cy="6578600"/>
+            <wp:extent cx="4572000" cy="4572000"/>
             <wp:effectExtent b="0" l="0" r="0" t="0"/>
-            <wp:docPr descr="" title="" id="90" name="Picture"/>
+            <wp:docPr descr="" title="" id="91" name="Picture"/>
             <a:graphic>
               <a:graphicData uri="http://schemas.openxmlformats.org/drawingml/2006/picture">
                 <pic:pic>
                   <pic:nvPicPr>
-                    <pic:cNvPr descr="06_01_lecture_powerpoint_files/figure-docx/unnamed-chunk-6-1.png" id="91" name="Picture"/>
+                    <pic:cNvPr descr="06_01_lecture_powerpoint_files/figure-docx/unnamed-chunk-7-1.png" id="92" name="Picture"/>
                     <pic:cNvPicPr>
                       <a:picLocks noChangeArrowheads="1" noChangeAspect="1"/>
                     </pic:cNvPicPr>
                   </pic:nvPicPr>
                   <pic:blipFill>
-                    <a:blip r:embed="rId89"/>
+                    <a:blip r:embed="rId90"/>
                     <a:stretch>
                       <a:fillRect/>
                     </a:stretch>
@@ -4460,7 +6317,7 @@
                   <pic:spPr bwMode="auto">
                     <a:xfrm>
                       <a:off x="0" y="0"/>
-                      <a:ext cx="6578600" cy="6578600"/>
+                      <a:ext cx="4572000" cy="4572000"/>
                     </a:xfrm>
                     <a:prstGeom prst="rect">
                       <a:avLst/>
@@ -4479,8 +6336,8 @@
         </w:drawing>
       </w:r>
     </w:p>
-    <w:bookmarkEnd w:id="92"/>
-    <w:bookmarkStart w:id="93" w:name="lecture-6-summary-and-key-takeaways"/>
+    <w:bookmarkEnd w:id="93"/>
+    <w:bookmarkStart w:id="94" w:name="lecture-6-summary-and-key-takeaways"/>
     <w:p>
       <w:pPr>
         <w:pStyle w:val="Heading1"/>
@@ -4753,7 +6610,7 @@
         <w:t xml:space="preserve">Account for non-independence in analysis</w:t>
       </w:r>
     </w:p>
-    <w:bookmarkEnd w:id="93"/>
+    <w:bookmarkEnd w:id="94"/>
     <w:sectPr>
       <w:pgSz w:h="15840" w:w="12240"/>
       <w:pgMar w:bottom="720" w:footer="720" w:gutter="0" w:header="720" w:left="1152" w:right="720" w:top="720"/>

</xml_diff>

<commit_message>
fixed 6 need to add power
</commit_message>
<xml_diff>
--- a/docs/ecostats_lectures/lecture_06/06_01_lecture_powerpoint.docx
+++ b/docs/ecostats_lectures/lecture_06/06_01_lecture_powerpoint.docx
@@ -102,7 +102,7 @@
       <w:r>
         <w:drawing>
           <wp:inline>
-            <wp:extent cx="2019300" cy="2457450"/>
+            <wp:extent cx="2466975" cy="3000375"/>
             <wp:effectExtent b="0" l="0" r="0" t="0"/>
             <wp:docPr descr="" title="" id="21" name="Picture"/>
             <a:graphic>
@@ -123,7 +123,7 @@
                   <pic:spPr bwMode="auto">
                     <a:xfrm>
                       <a:off x="0" y="0"/>
-                      <a:ext cx="2019300" cy="2457450"/>
+                      <a:ext cx="2466975" cy="3000375"/>
                     </a:xfrm>
                     <a:prstGeom prst="rect">
                       <a:avLst/>

</xml_diff>